<commit_message>
KOS voce 24: conteggio delle TV nella documentazione (16 str.*, 2 lnd.*)
Co-Authored-By: Claude Opus 5.5 <noreply@anthropic.com>
Claude-Session: https://claude.ai/code/session_01Rr1X44gsg7BUwMzrRvYrc2
</commit_message>
<xml_diff>
--- a/docs/docx/kos-24.docx
+++ b/docs/docx/kos-24.docx
@@ -1851,13 +1851,37 @@
         <w:t xml:space="preserve">kosgroup/deploy/kos-24.json</w:t>
       </w:r>
       <w:r>
-        <w:t xml:space="preserve">, nessun effetto visibile): impostazioni dei template, 15 TV</w:t>
-      </w:r>
-      <w:r>
-        <w:t xml:space="preserve"> </w:t>
-      </w:r>
-      <w:r>
-        <w:t xml:space="preserve">nuove, libreria aggiornata, interruttore spento. Sullo stage subito; in produzione con gli head o prima</w:t>
+        <w:t xml:space="preserve">, nessun effetto visibile): impostazioni dei template, 18 TV</w:t>
+      </w:r>
+      <w:r>
+        <w:t xml:space="preserve"> </w:t>
+      </w:r>
+      <w:r>
+        <w:t xml:space="preserve">nuove (16</w:t>
+      </w:r>
+      <w:r>
+        <w:t xml:space="preserve"> </w:t>
+      </w:r>
+      <w:r>
+        <w:rPr>
+          <w:rStyle w:val="VerbatimChar"/>
+        </w:rPr>
+        <w:t xml:space="preserve">str.*</w:t>
+      </w:r>
+      <w:r>
+        <w:t xml:space="preserve">, 2</w:t>
+      </w:r>
+      <w:r>
+        <w:t xml:space="preserve"> </w:t>
+      </w:r>
+      <w:r>
+        <w:rPr>
+          <w:rStyle w:val="VerbatimChar"/>
+        </w:rPr>
+        <w:t xml:space="preserve">lnd.*</w:t>
+      </w:r>
+      <w:r>
+        <w:t xml:space="preserve">), libreria aggiornata, interruttore spento. Sullo stage subito; in produzione con gli head o prima</w:t>
       </w:r>
       <w:r>
         <w:t xml:space="preserve"> </w:t>

</xml_diff>

<commit_message>
KOS voce 24: import delle TV anagrafiche dall'export Yext (strutture-in-tv.py), dati e report dell'export del 25/10
Co-Authored-By: Claude Opus 5.5 <noreply@anthropic.com>
Claude-Session: https://claude.ai/code/session_01Rr1X44gsg7BUwMzrRvYrc2
</commit_message>
<xml_diff>
--- a/docs/docx/kos-24.docx
+++ b/docs/docx/kos-24.docx
@@ -2,7 +2,7 @@
 <file path=word/document.xml><?xml version="1.0" encoding="utf-8"?>
 <w:document xmlns:w="http://schemas.openxmlformats.org/wordprocessingml/2006/main" xmlns:m="http://schemas.openxmlformats.org/officeDocument/2006/math" xmlns:r="http://schemas.openxmlformats.org/officeDocument/2006/relationships" xmlns:o="urn:schemas-microsoft-com:office:office" xmlns:v="urn:schemas-microsoft-com:vml" xmlns:w10="urn:schemas-microsoft-com:office:word" xmlns:a="http://schemas.openxmlformats.org/drawingml/2006/main" xmlns:pic="http://schemas.openxmlformats.org/drawingml/2006/picture" xmlns:wp="http://schemas.openxmlformats.org/drawingml/2006/wordprocessingDrawing">
   <w:body>
-    <w:bookmarkStart w:id="25" w:name="X13e9b4acbf3cd705c9b15ec2eaf204881b0b6a6"/>
+    <w:bookmarkStart w:id="26" w:name="X13e9b4acbf3cd705c9b15ec2eaf204881b0b6a6"/>
     <w:p>
       <w:pPr>
         <w:pStyle w:val="Heading1"/>
@@ -2123,7 +2123,112 @@
       </w:r>
     </w:p>
     <w:bookmarkEnd w:id="24"/>
+    <w:bookmarkStart w:id="25" w:name="import-dallexport-yext-prova-del-2510"/>
+    <w:p>
+      <w:pPr>
+        <w:pStyle w:val="Heading2"/>
+      </w:pPr>
+      <w:r>
+        <w:t xml:space="preserve">Import dall'export Yext (prova del 25/10)</w:t>
+      </w:r>
+    </w:p>
+    <w:p>
+      <w:pPr>
+        <w:pStyle w:val="FirstParagraph"/>
+      </w:pPr>
+      <w:r>
+        <w:rPr>
+          <w:rStyle w:val="VerbatimChar"/>
+        </w:rPr>
+        <w:t xml:space="preserve">scripts/yext/strutture-in-tv.py &lt;export.xlsx&gt;</w:t>
+      </w:r>
+      <w:r>
+        <w:t xml:space="preserve"> </w:t>
+      </w:r>
+      <w:r>
+        <w:t xml:space="preserve">produce</w:t>
+      </w:r>
+      <w:r>
+        <w:t xml:space="preserve"> </w:t>
+      </w:r>
+      <w:r>
+        <w:rPr>
+          <w:rStyle w:val="VerbatimChar"/>
+        </w:rPr>
+        <w:t xml:space="preserve">kosgroup/dati/voce-24/strutture-yext-&lt;data&gt;.json</w:t>
+      </w:r>
+      <w:r>
+        <w:t xml:space="preserve">, da applicare</w:t>
+      </w:r>
+      <w:r>
+        <w:t xml:space="preserve"> </w:t>
+      </w:r>
+      <w:r>
+        <w:t xml:space="preserve">con</w:t>
+      </w:r>
+      <w:r>
+        <w:t xml:space="preserve"> </w:t>
+      </w:r>
+      <w:r>
+        <w:rPr>
+          <w:rStyle w:val="VerbatimChar"/>
+        </w:rPr>
+        <w:t xml:space="preserve">imposta-tv.php</w:t>
+      </w:r>
+      <w:r>
+        <w:t xml:space="preserve">, e</w:t>
+      </w:r>
+      <w:r>
+        <w:t xml:space="preserve"> </w:t>
+      </w:r>
+      <w:r>
+        <w:rPr>
+          <w:rStyle w:val="VerbatimChar"/>
+        </w:rPr>
+        <w:t xml:space="preserve">report-yext-&lt;data&gt;.md</w:t>
+      </w:r>
+      <w:r>
+        <w:t xml:space="preserve">. Export del 25/10: 60 entità su kosgroup.com, 57 schede importabili.</w:t>
+      </w:r>
+      <w:r>
+        <w:t xml:space="preserve"> </w:t>
+      </w:r>
+      <w:r>
+        <w:t xml:space="preserve">Non entrano: le due entità di Poliambulatorio Villalba sulla stessa scheda e Villa Margherita Vicenza, che punta a</w:t>
+      </w:r>
+      <w:r>
+        <w:t xml:space="preserve"> </w:t>
+      </w:r>
+      <w:r>
+        <w:rPr>
+          <w:rStyle w:val="VerbatimChar"/>
+        </w:rPr>
+        <w:t xml:space="preserve">/it/villa-margherita</w:t>
+      </w:r>
+      <w:r>
+        <w:t xml:space="preserve">. Il report elenca quello che va corretto in Yext entro il 30/10: 19 schede con lo stesso orario</w:t>
+      </w:r>
+      <w:r>
+        <w:t xml:space="preserve"> </w:t>
+      </w:r>
+      <w:r>
+        <w:t xml:space="preserve">sette giorni su sette, 9 email assenti, 4 place_id mancanti, marchi non validi, 34 indirizzi abbreviati («V.», «V.le»)</w:t>
+      </w:r>
+      <w:r>
+        <w:t xml:space="preserve"> </w:t>
+      </w:r>
+      <w:r>
+        <w:t xml:space="preserve">che lo script scrive per esteso. L'export conferma anche che i profili Google sono collegati all'organizzazione Google</w:t>
+      </w:r>
+      <w:r>
+        <w:t xml:space="preserve"> </w:t>
+      </w:r>
+      <w:r>
+        <w:t xml:space="preserve">di Yext («GMB Organization»): al passaggio a RetailTune la proprietà dei profili va trasferita a un account di KOS.</w:t>
+      </w:r>
+    </w:p>
     <w:bookmarkEnd w:id="25"/>
+    <w:bookmarkEnd w:id="26"/>
     <w:sectPr/>
   </w:body>
 </w:document>

</xml_diff>

<commit_message>
KOS voce 24: conteggi del report Yext nella documentazione
Co-Authored-By: Claude Opus 5.5 <noreply@anthropic.com>
Claude-Session: https://claude.ai/code/session_01Rr1X44gsg7BUwMzrRvYrc2
</commit_message>
<xml_diff>
--- a/docs/docx/kos-24.docx
+++ b/docs/docx/kos-24.docx
@@ -2206,13 +2206,13 @@
         <w:t xml:space="preserve">/it/villa-margherita</w:t>
       </w:r>
       <w:r>
-        <w:t xml:space="preserve">. Il report elenca quello che va corretto in Yext entro il 30/10: 19 schede con lo stesso orario</w:t>
-      </w:r>
-      <w:r>
-        <w:t xml:space="preserve"> </w:t>
-      </w:r>
-      <w:r>
-        <w:t xml:space="preserve">sette giorni su sette, 9 email assenti, 4 place_id mancanti, marchi non validi, 34 indirizzi abbreviati («V.», «V.le»)</w:t>
+        <w:t xml:space="preserve">. Il report elenca quello che va corretto in Yext entro il 30/10: 20 schede con lo stesso orario</w:t>
+      </w:r>
+      <w:r>
+        <w:t xml:space="preserve"> </w:t>
+      </w:r>
+      <w:r>
+        <w:t xml:space="preserve">sette giorni su sette, 9 email assenti, 4 place_id mancanti, il marchio «0» di Casa Varazze, 34 indirizzi abbreviati («V.», «V.le»)</w:t>
       </w:r>
       <w:r>
         <w:t xml:space="preserve"> </w:t>

</xml_diff>

<commit_message>
KOS voce 24: nodo struttura solo con indirizzo (schede senza dati e pagine di servizio restano WebPage); esito della prova sullo stage
Co-Authored-By: Claude Opus 5.5 <noreply@anthropic.com>
Claude-Session: https://claude.ai/code/session_01Rr1X44gsg7BUwMzrRvYrc2
</commit_message>
<xml_diff>
--- a/docs/docx/kos-24.docx
+++ b/docs/docx/kos-24.docx
@@ -2,7 +2,7 @@
 <file path=word/document.xml><?xml version="1.0" encoding="utf-8"?>
 <w:document xmlns:w="http://schemas.openxmlformats.org/wordprocessingml/2006/main" xmlns:m="http://schemas.openxmlformats.org/officeDocument/2006/math" xmlns:r="http://schemas.openxmlformats.org/officeDocument/2006/relationships" xmlns:o="urn:schemas-microsoft-com:office:office" xmlns:v="urn:schemas-microsoft-com:vml" xmlns:w10="urn:schemas-microsoft-com:office:word" xmlns:a="http://schemas.openxmlformats.org/drawingml/2006/main" xmlns:pic="http://schemas.openxmlformats.org/drawingml/2006/picture" xmlns:wp="http://schemas.openxmlformats.org/drawingml/2006/wordprocessingDrawing">
   <w:body>
-    <w:bookmarkStart w:id="26" w:name="X13e9b4acbf3cd705c9b15ec2eaf204881b0b6a6"/>
+    <w:bookmarkStart w:id="27" w:name="X13e9b4acbf3cd705c9b15ec2eaf204881b0b6a6"/>
     <w:p>
       <w:pPr>
         <w:pStyle w:val="Heading1"/>
@@ -2123,7 +2123,7 @@
       </w:r>
     </w:p>
     <w:bookmarkEnd w:id="24"/>
-    <w:bookmarkStart w:id="25" w:name="import-dallexport-yext-prova-del-2510"/>
+    <w:bookmarkStart w:id="26" w:name="import-dallexport-yext-prova-del-2510"/>
     <w:p>
       <w:pPr>
         <w:pStyle w:val="Heading2"/>
@@ -2225,10 +2225,91 @@
       </w:r>
       <w:r>
         <w:t xml:space="preserve">di Yext («GMB Organization»): al passaggio a RetailTune la proprietà dei profili va trasferita a un account di KOS.</w:t>
+      </w:r>
+    </w:p>
+    <w:bookmarkStart w:id="25" w:name="prova-sullo-stage-2510"/>
+    <w:p>
+      <w:pPr>
+        <w:pStyle w:val="Heading3"/>
+      </w:pPr>
+      <w:r>
+        <w:t xml:space="preserve">Prova sullo stage (25/10)</w:t>
+      </w:r>
+    </w:p>
+    <w:p>
+      <w:pPr>
+        <w:pStyle w:val="FirstParagraph"/>
+      </w:pPr>
+      <w:r>
+        <w:t xml:space="preserve">TV scritte su 57 schede (808 valori). Controllo di tutte le 64 pagine dei template delle schede: 57 schede con nodo</w:t>
+      </w:r>
+      <w:r>
+        <w:t xml:space="preserve"> </w:t>
+      </w:r>
+      <w:r>
+        <w:t xml:space="preserve">completo (indirizzo, telefono, coordinate, orari). Senza dati Yext: Poliambulatorio Villalba (due entità Yext),</w:t>
+      </w:r>
+      <w:r>
+        <w:t xml:space="preserve"> </w:t>
+      </w:r>
+      <w:r>
+        <w:t xml:space="preserve">Villa Margherita Vicenza riabilitazione e psichiatria (l'entità Yext punta a</w:t>
+      </w:r>
+      <w:r>
+        <w:t xml:space="preserve"> </w:t>
+      </w:r>
+      <w:r>
+        <w:rPr>
+          <w:rStyle w:val="VerbatimChar"/>
+        </w:rPr>
+        <w:t xml:space="preserve">/it/villa-margherita</w:t>
+      </w:r>
+      <w:r>
+        <w:t xml:space="preserve">), Poliambulatorio</w:t>
+      </w:r>
+      <w:r>
+        <w:t xml:space="preserve"> </w:t>
+      </w:r>
+      <w:r>
+        <w:t xml:space="preserve">Parco di Veio (l'entità punta ad anniazzurri.it), Santo Stefano Casorate e Santo Stefano Mede (nessuna entità Yext).</w:t>
+      </w:r>
+      <w:r>
+        <w:t xml:space="preserve"> </w:t>
+      </w:r>
+      <w:r>
+        <w:t xml:space="preserve">Correzione emersa: il nodo esce solo se la scheda ha l'indirizzo (</w:t>
+      </w:r>
+      <w:r>
+        <w:rPr>
+          <w:rStyle w:val="VerbatimChar"/>
+        </w:rPr>
+        <w:t xml:space="preserve">str.via</w:t>
+      </w:r>
+      <w:r>
+        <w:t xml:space="preserve">), così le schede senza dati e le pagine di</w:t>
+      </w:r>
+      <w:r>
+        <w:t xml:space="preserve"> </w:t>
+      </w:r>
+      <w:r>
+        <w:t xml:space="preserve">servizio con lo stesso template (Ritiro referti) restano una semplice</w:t>
+      </w:r>
+      <w:r>
+        <w:t xml:space="preserve"> </w:t>
+      </w:r>
+      <w:r>
+        <w:rPr>
+          <w:rStyle w:val="VerbatimChar"/>
+        </w:rPr>
+        <w:t xml:space="preserve">WebPage</w:t>
+      </w:r>
+      <w:r>
+        <w:t xml:space="preserve">.</w:t>
       </w:r>
     </w:p>
     <w:bookmarkEnd w:id="25"/>
     <w:bookmarkEnd w:id="26"/>
+    <w:bookmarkEnd w:id="27"/>
     <w:sectPr/>
   </w:body>
 </w:document>

</xml_diff>

<commit_message>
KOS voce 24: DiagnosticLab affiancato a MedicalBusiness (geo, orari e mappa validi); esito dei validatori
Co-Authored-By: Claude Opus 5.5 <noreply@anthropic.com>
Claude-Session: https://claude.ai/code/session_01Rr1X44gsg7BUwMzrRvYrc2
</commit_message>
<xml_diff>
--- a/docs/docx/kos-24.docx
+++ b/docs/docx/kos-24.docx
@@ -2305,6 +2305,65 @@
       </w:r>
       <w:r>
         <w:t xml:space="preserve">.</w:t>
+      </w:r>
+    </w:p>
+    <w:p>
+      <w:pPr>
+        <w:pStyle w:val="BodyText"/>
+      </w:pPr>
+      <w:r>
+        <w:t xml:space="preserve">Validatori (25/10): Centro Ambulatoriale Santo Stefano Jesi 0 errori e 0 avvisi su schema.org, «Attività locali» valida nel</w:t>
+      </w:r>
+      <w:r>
+        <w:t xml:space="preserve"> </w:t>
+      </w:r>
+      <w:r>
+        <w:t xml:space="preserve">Rich Results Test. Punto Prelievi Gamma: 11 avvisi, perché</w:t>
+      </w:r>
+      <w:r>
+        <w:t xml:space="preserve"> </w:t>
+      </w:r>
+      <w:r>
+        <w:rPr>
+          <w:rStyle w:val="VerbatimChar"/>
+        </w:rPr>
+        <w:t xml:space="preserve">DiagnosticLab</w:t>
+      </w:r>
+      <w:r>
+        <w:t xml:space="preserve"> </w:t>
+      </w:r>
+      <w:r>
+        <w:t xml:space="preserve">è solo un'organizzazione e non ammette</w:t>
+      </w:r>
+      <w:r>
+        <w:t xml:space="preserve"> </w:t>
+      </w:r>
+      <w:r>
+        <w:t xml:space="preserve">indirizzo geografico, orari e mappa. Corretto nella libreria: un tipo che non è un'attività locale si affianca a</w:t>
+      </w:r>
+      <w:r>
+        <w:t xml:space="preserve"> </w:t>
+      </w:r>
+      <w:r>
+        <w:rPr>
+          <w:rStyle w:val="VerbatimChar"/>
+        </w:rPr>
+        <w:t xml:space="preserve">MedicalBusiness</w:t>
+      </w:r>
+      <w:r>
+        <w:t xml:space="preserve"> </w:t>
+      </w:r>
+      <w:r>
+        <w:t xml:space="preserve">(</w:t>
+      </w:r>
+      <w:r>
+        <w:rPr>
+          <w:rStyle w:val="VerbatimChar"/>
+        </w:rPr>
+        <w:t xml:space="preserve">["DiagnosticLab", "MedicalBusiness"]</w:t>
+      </w:r>
+      <w:r>
+        <w:t xml:space="preserve">).</w:t>
       </w:r>
     </w:p>
     <w:bookmarkEnd w:id="25"/>

</xml_diff>

<commit_message>
KOS voce 24: prenotazione online (TV str.prenotazione, ReserveAction), dall'URL di prenotazione di Yext
Co-Authored-By: Claude Opus 5.5 <noreply@anthropic.com>
Claude-Session: https://claude.ai/code/session_01Rr1X44gsg7BUwMzrRvYrc2
</commit_message>
<xml_diff>
--- a/docs/docx/kos-24.docx
+++ b/docs/docx/kos-24.docx
@@ -1298,6 +1298,65 @@
               <w:rPr>
                 <w:rStyle w:val="VerbatimChar"/>
               </w:rPr>
+              <w:t xml:space="preserve">str.prenotazione</w:t>
+            </w:r>
+          </w:p>
+        </w:tc>
+        <w:tc>
+          <w:tcPr/>
+          <w:p>
+            <w:pPr>
+              <w:pStyle w:val="Compact"/>
+              <w:jc w:val="left"/>
+            </w:pPr>
+            <w:r>
+              <w:t xml:space="preserve">URL https della prenotazione online della struttura</w:t>
+            </w:r>
+          </w:p>
+        </w:tc>
+        <w:tc>
+          <w:tcPr/>
+          <w:p>
+            <w:pPr>
+              <w:pStyle w:val="Compact"/>
+              <w:jc w:val="left"/>
+            </w:pPr>
+            <w:r>
+              <w:rPr>
+                <w:rStyle w:val="VerbatimChar"/>
+              </w:rPr>
+              <w:t xml:space="preserve">potentialAction</w:t>
+            </w:r>
+            <w:r>
+              <w:t xml:space="preserve"> </w:t>
+            </w:r>
+            <w:r>
+              <w:t xml:space="preserve">→</w:t>
+            </w:r>
+            <w:r>
+              <w:t xml:space="preserve"> </w:t>
+            </w:r>
+            <w:r>
+              <w:rPr>
+                <w:rStyle w:val="VerbatimChar"/>
+              </w:rPr>
+              <w:t xml:space="preserve">ReserveAction</w:t>
+            </w:r>
+          </w:p>
+        </w:tc>
+      </w:tr>
+      <w:tr>
+        <w:tc>
+          <w:tcPr/>
+          <w:p>
+            <w:pPr>
+              <w:pStyle w:val="Compact"/>
+              <w:jc w:val="left"/>
+            </w:pPr>
+            <w:r>
+              <w:rPr>
+                <w:rStyle w:val="VerbatimChar"/>
+              </w:rPr>
               <w:t xml:space="preserve">lnd.struttura</w:t>
             </w:r>
           </w:p>
@@ -1851,13 +1910,13 @@
         <w:t xml:space="preserve">kosgroup/deploy/kos-24.json</w:t>
       </w:r>
       <w:r>
-        <w:t xml:space="preserve">, nessun effetto visibile): impostazioni dei template, 18 TV</w:t>
-      </w:r>
-      <w:r>
-        <w:t xml:space="preserve"> </w:t>
-      </w:r>
-      <w:r>
-        <w:t xml:space="preserve">nuove (16</w:t>
+        <w:t xml:space="preserve">, nessun effetto visibile): impostazioni dei template, 19 TV</w:t>
+      </w:r>
+      <w:r>
+        <w:t xml:space="preserve"> </w:t>
+      </w:r>
+      <w:r>
+        <w:t xml:space="preserve">nuove (17</w:t>
       </w:r>
       <w:r>
         <w:t xml:space="preserve"> </w:t>
@@ -2364,6 +2423,117 @@
       </w:r>
       <w:r>
         <w:t xml:space="preserve">).</w:t>
+      </w:r>
+    </w:p>
+    <w:p>
+      <w:pPr>
+        <w:pStyle w:val="BodyText"/>
+      </w:pPr>
+      <w:r>
+        <w:rPr>
+          <w:bCs/>
+          <w:b/>
+        </w:rPr>
+        <w:t xml:space="preserve">Miglioria decisa il 25/10 (dentro la voce 24): prenotazione online.</w:t>
+      </w:r>
+      <w:r>
+        <w:t xml:space="preserve"> </w:t>
+      </w:r>
+      <w:r>
+        <w:t xml:space="preserve">TV</w:t>
+      </w:r>
+      <w:r>
+        <w:t xml:space="preserve"> </w:t>
+      </w:r>
+      <w:r>
+        <w:rPr>
+          <w:rStyle w:val="VerbatimChar"/>
+        </w:rPr>
+        <w:t xml:space="preserve">str.prenotazione</w:t>
+      </w:r>
+      <w:r>
+        <w:t xml:space="preserve">, importata dall'«URL di</w:t>
+      </w:r>
+      <w:r>
+        <w:t xml:space="preserve"> </w:t>
+      </w:r>
+      <w:r>
+        <w:t xml:space="preserve">prenotazione» di Yext (12 schede su 16; esclusi i link non https, come quello della Clinica Dentale Porto Potenza</w:t>
+      </w:r>
+      <w:r>
+        <w:t xml:space="preserve"> </w:t>
+      </w:r>
+      <w:r>
+        <w:t xml:space="preserve">Picena verso il vecchio dominio</w:t>
+      </w:r>
+      <w:r>
+        <w:t xml:space="preserve"> </w:t>
+      </w:r>
+      <w:r>
+        <w:rPr>
+          <w:rStyle w:val="VerbatimChar"/>
+        </w:rPr>
+        <w:t xml:space="preserve">clinicadentale.sstefano.it</w:t>
+      </w:r>
+      <w:r>
+        <w:t xml:space="preserve">). Nel nodo diventa</w:t>
+      </w:r>
+      <w:r>
+        <w:t xml:space="preserve"> </w:t>
+      </w:r>
+      <w:r>
+        <w:rPr>
+          <w:rStyle w:val="VerbatimChar"/>
+        </w:rPr>
+        <w:t xml:space="preserve">potentialAction</w:t>
+      </w:r>
+      <w:r>
+        <w:t xml:space="preserve"> </w:t>
+      </w:r>
+      <w:r>
+        <w:t xml:space="preserve">→</w:t>
+      </w:r>
+      <w:r>
+        <w:t xml:space="preserve"> </w:t>
+      </w:r>
+      <w:r>
+        <w:rPr>
+          <w:rStyle w:val="VerbatimChar"/>
+        </w:rPr>
+        <w:t xml:space="preserve">ReserveAction</w:t>
+      </w:r>
+      <w:r>
+        <w:t xml:space="preserve">:</w:t>
+      </w:r>
+      <w:r>
+        <w:t xml:space="preserve"> </w:t>
+      </w:r>
+      <w:r>
+        <w:t xml:space="preserve">Google non lo usa per i risultati avanzati, ma è un'indicazione utile agli assistenti AI su dove si prenota. Quasi</w:t>
+      </w:r>
+      <w:r>
+        <w:t xml:space="preserve"> </w:t>
+      </w:r>
+      <w:r>
+        <w:t xml:space="preserve">tutte le schede rimandano alla pagina generica</w:t>
+      </w:r>
+      <w:r>
+        <w:t xml:space="preserve"> </w:t>
+      </w:r>
+      <w:r>
+        <w:rPr>
+          <w:rStyle w:val="VerbatimChar"/>
+        </w:rPr>
+        <w:t xml:space="preserve">/it/prenota-online</w:t>
+      </w:r>
+      <w:r>
+        <w:t xml:space="preserve">: meglio il link di prenotazione della singola</w:t>
+      </w:r>
+      <w:r>
+        <w:t xml:space="preserve"> </w:t>
+      </w:r>
+      <w:r>
+        <w:t xml:space="preserve">struttura (TuoTempo), da chiedere a KOS.</w:t>
       </w:r>
     </w:p>
     <w:bookmarkEnd w:id="25"/>

</xml_diff>

<commit_message>
KOS voce 24: Servizi e Cure di Yext → specialità e servizi (TV str.servizi, availableService/availableTest/knowsAbout), tabella proposta
Co-Authored-By: Claude Opus 5.5 <noreply@anthropic.com>
Claude-Session: https://claude.ai/code/session_01Rr1X44gsg7BUwMzrRvYrc2
</commit_message>
<xml_diff>
--- a/docs/docx/kos-24.docx
+++ b/docs/docx/kos-24.docx
@@ -2,7 +2,7 @@
 <file path=word/document.xml><?xml version="1.0" encoding="utf-8"?>
 <w:document xmlns:w="http://schemas.openxmlformats.org/wordprocessingml/2006/main" xmlns:m="http://schemas.openxmlformats.org/officeDocument/2006/math" xmlns:r="http://schemas.openxmlformats.org/officeDocument/2006/relationships" xmlns:o="urn:schemas-microsoft-com:office:office" xmlns:v="urn:schemas-microsoft-com:vml" xmlns:w10="urn:schemas-microsoft-com:office:word" xmlns:a="http://schemas.openxmlformats.org/drawingml/2006/main" xmlns:pic="http://schemas.openxmlformats.org/drawingml/2006/picture" xmlns:wp="http://schemas.openxmlformats.org/drawingml/2006/wordprocessingDrawing">
   <w:body>
-    <w:bookmarkStart w:id="27" w:name="X13e9b4acbf3cd705c9b15ec2eaf204881b0b6a6"/>
+    <w:bookmarkStart w:id="28" w:name="X13e9b4acbf3cd705c9b15ec2eaf204881b0b6a6"/>
     <w:p>
       <w:pPr>
         <w:pStyle w:val="Heading1"/>
@@ -1357,6 +1357,83 @@
               <w:rPr>
                 <w:rStyle w:val="VerbatimChar"/>
               </w:rPr>
+              <w:t xml:space="preserve">str.servizi</w:t>
+            </w:r>
+          </w:p>
+        </w:tc>
+        <w:tc>
+          <w:tcPr/>
+          <w:p>
+            <w:pPr>
+              <w:pStyle w:val="Compact"/>
+              <w:jc w:val="left"/>
+            </w:pPr>
+            <w:r>
+              <w:rPr>
+                <w:rStyle w:val="VerbatimChar"/>
+              </w:rPr>
+              <w:t xml:space="preserve">Tipo|Nome</w:t>
+            </w:r>
+            <w:r>
+              <w:t xml:space="preserve"> </w:t>
+            </w:r>
+            <w:r>
+              <w:t xml:space="preserve">per riga, dai filtri «Servizi e Cure» di Yext</w:t>
+            </w:r>
+          </w:p>
+        </w:tc>
+        <w:tc>
+          <w:tcPr/>
+          <w:p>
+            <w:pPr>
+              <w:pStyle w:val="Compact"/>
+              <w:jc w:val="left"/>
+            </w:pPr>
+            <w:r>
+              <w:rPr>
+                <w:rStyle w:val="VerbatimChar"/>
+              </w:rPr>
+              <w:t xml:space="preserve">availableService</w:t>
+            </w:r>
+            <w:r>
+              <w:t xml:space="preserve">,</w:t>
+            </w:r>
+            <w:r>
+              <w:t xml:space="preserve"> </w:t>
+            </w:r>
+            <w:r>
+              <w:rPr>
+                <w:rStyle w:val="VerbatimChar"/>
+              </w:rPr>
+              <w:t xml:space="preserve">availableTest</w:t>
+            </w:r>
+            <w:r>
+              <w:t xml:space="preserve">,</w:t>
+            </w:r>
+            <w:r>
+              <w:t xml:space="preserve"> </w:t>
+            </w:r>
+            <w:r>
+              <w:rPr>
+                <w:rStyle w:val="VerbatimChar"/>
+              </w:rPr>
+              <w:t xml:space="preserve">knowsAbout</w:t>
+            </w:r>
+          </w:p>
+        </w:tc>
+      </w:tr>
+      <w:tr>
+        <w:tc>
+          <w:tcPr/>
+          <w:p>
+            <w:pPr>
+              <w:pStyle w:val="Compact"/>
+              <w:jc w:val="left"/>
+            </w:pPr>
+            <w:r>
+              <w:rPr>
+                <w:rStyle w:val="VerbatimChar"/>
+              </w:rPr>
               <w:t xml:space="preserve">lnd.struttura</w:t>
             </w:r>
           </w:p>
@@ -1910,13 +1987,13 @@
         <w:t xml:space="preserve">kosgroup/deploy/kos-24.json</w:t>
       </w:r>
       <w:r>
-        <w:t xml:space="preserve">, nessun effetto visibile): impostazioni dei template, 19 TV</w:t>
-      </w:r>
-      <w:r>
-        <w:t xml:space="preserve"> </w:t>
-      </w:r>
-      <w:r>
-        <w:t xml:space="preserve">nuove (17</w:t>
+        <w:t xml:space="preserve">, nessun effetto visibile): impostazioni dei template, 20 TV</w:t>
+      </w:r>
+      <w:r>
+        <w:t xml:space="preserve"> </w:t>
+      </w:r>
+      <w:r>
+        <w:t xml:space="preserve">nuove (18</w:t>
       </w:r>
       <w:r>
         <w:t xml:space="preserve"> </w:t>
@@ -2538,7 +2615,2192 @@
     </w:p>
     <w:bookmarkEnd w:id="25"/>
     <w:bookmarkEnd w:id="26"/>
+    <w:bookmarkStart w:id="27" w:name="X934602c1bb27f8fe6e53958400661b38ee4eb3f"/>
+    <w:p>
+      <w:pPr>
+        <w:pStyle w:val="Heading2"/>
+      </w:pPr>
+      <w:r>
+        <w:t xml:space="preserve">Servizi e Cure: specialità e servizi (PROPOSTA del 25/10, da approvare con la tabella dei tipi)</w:t>
+      </w:r>
+    </w:p>
+    <w:p>
+      <w:pPr>
+        <w:pStyle w:val="FirstParagraph"/>
+      </w:pPr>
+      <w:r>
+        <w:t xml:space="preserve">I filtri della mappa Yext («Servizi e Cure», 53 voci su 58 strutture KOS) completano il nodo struttura. Ogni voce dà</w:t>
+      </w:r>
+      <w:r>
+        <w:t xml:space="preserve"> </w:t>
+      </w:r>
+      <w:r>
+        <w:t xml:space="preserve">una o più specialità schema.org (</w:t>
+      </w:r>
+      <w:r>
+        <w:rPr>
+          <w:rStyle w:val="VerbatimChar"/>
+        </w:rPr>
+        <w:t xml:space="preserve">medicalSpecialty</w:t>
+      </w:r>
+      <w:r>
+        <w:t xml:space="preserve">) e, se è un servizio o una condizione, una riga della TV</w:t>
+      </w:r>
+      <w:r>
+        <w:t xml:space="preserve"> </w:t>
+      </w:r>
+      <w:r>
+        <w:rPr>
+          <w:rStyle w:val="VerbatimChar"/>
+        </w:rPr>
+        <w:t xml:space="preserve">str.servizi</w:t>
+      </w:r>
+      <w:r>
+        <w:t xml:space="preserve">. Nel nodo i servizi vanno in</w:t>
+      </w:r>
+      <w:r>
+        <w:t xml:space="preserve"> </w:t>
+      </w:r>
+      <w:r>
+        <w:rPr>
+          <w:rStyle w:val="VerbatimChar"/>
+        </w:rPr>
+        <w:t xml:space="preserve">availableService</w:t>
+      </w:r>
+      <w:r>
+        <w:t xml:space="preserve"> </w:t>
+      </w:r>
+      <w:r>
+        <w:t xml:space="preserve">(MedicalClinic, Hospital) o</w:t>
+      </w:r>
+      <w:r>
+        <w:t xml:space="preserve"> </w:t>
+      </w:r>
+      <w:r>
+        <w:rPr>
+          <w:rStyle w:val="VerbatimChar"/>
+        </w:rPr>
+        <w:t xml:space="preserve">availableTest</w:t>
+      </w:r>
+      <w:r>
+        <w:t xml:space="preserve"> </w:t>
+      </w:r>
+      <w:r>
+        <w:t xml:space="preserve">(DiagnosticLab); le condizioni trattate, e ciò che il tipo non ammette, in</w:t>
+      </w:r>
+      <w:r>
+        <w:t xml:space="preserve"> </w:t>
+      </w:r>
+      <w:r>
+        <w:rPr>
+          <w:rStyle w:val="VerbatimChar"/>
+        </w:rPr>
+        <w:t xml:space="preserve">knowsAbout</w:t>
+      </w:r>
+      <w:r>
+        <w:t xml:space="preserve">. Esempio: Villa dei Pini</w:t>
+      </w:r>
+      <w:r>
+        <w:t xml:space="preserve"> </w:t>
+      </w:r>
+      <w:r>
+        <w:t xml:space="preserve">Civitanova passa da nessuna specialità a 14, con 7 esami. La stessa tabella può servire agli attributi dei filtri in</w:t>
+      </w:r>
+      <w:r>
+        <w:t xml:space="preserve"> </w:t>
+      </w:r>
+      <w:r>
+        <w:t xml:space="preserve">RetailTune. Dati:</w:t>
+      </w:r>
+      <w:r>
+        <w:t xml:space="preserve"> </w:t>
+      </w:r>
+      <w:r>
+        <w:rPr>
+          <w:rStyle w:val="VerbatimChar"/>
+        </w:rPr>
+        <w:t xml:space="preserve">kosgroup/dati/voce-24/servizi-e-cure.json</w:t>
+      </w:r>
+      <w:r>
+        <w:t xml:space="preserve">. Da correggere in Yext due voci scritte male:</w:t>
+      </w:r>
+      <w:r>
+        <w:t xml:space="preserve"> </w:t>
+      </w:r>
+      <w:r>
+        <w:t xml:space="preserve">«Endrocrinologia» e «Gastroentereologia».</w:t>
+      </w:r>
+    </w:p>
+    <w:tbl>
+      <w:tblPr>
+        <w:tblStyle w:val="Table"/>
+        <w:tblW w:type="auto" w:w="0"/>
+        <w:tblLook w:firstRow="1" w:lastRow="0" w:firstColumn="0" w:lastColumn="0" w:noHBand="0" w:noVBand="0" w:val="0020"/>
+        <w:jc w:val="start"/>
+      </w:tblPr>
+      <w:tblGrid>
+        <w:gridCol w:w="2640"/>
+        <w:gridCol w:w="2640"/>
+        <w:gridCol w:w="2640"/>
+      </w:tblGrid>
+      <w:tr>
+        <w:trPr>
+          <w:tblHeader w:val="true"/>
+        </w:trPr>
+        <w:tc>
+          <w:tcPr/>
+          <w:p>
+            <w:pPr>
+              <w:pStyle w:val="Compact"/>
+              <w:jc w:val="left"/>
+            </w:pPr>
+            <w:r>
+              <w:t xml:space="preserve">Voce Yext</w:t>
+            </w:r>
+          </w:p>
+        </w:tc>
+        <w:tc>
+          <w:tcPr/>
+          <w:p>
+            <w:pPr>
+              <w:pStyle w:val="Compact"/>
+              <w:jc w:val="left"/>
+            </w:pPr>
+            <w:r>
+              <w:t xml:space="preserve">Specialità schema.org</w:t>
+            </w:r>
+          </w:p>
+        </w:tc>
+        <w:tc>
+          <w:tcPr/>
+          <w:p>
+            <w:pPr>
+              <w:pStyle w:val="Compact"/>
+              <w:jc w:val="left"/>
+            </w:pPr>
+            <w:r>
+              <w:t xml:space="preserve">Nel nodo</w:t>
+            </w:r>
+          </w:p>
+        </w:tc>
+      </w:tr>
+      <w:tr>
+        <w:tc>
+          <w:tcPr/>
+          <w:p>
+            <w:pPr>
+              <w:pStyle w:val="Compact"/>
+              <w:jc w:val="left"/>
+            </w:pPr>
+            <w:r>
+              <w:t xml:space="preserve">Assistenza stati vegetativi persistenti</w:t>
+            </w:r>
+          </w:p>
+        </w:tc>
+        <w:tc>
+          <w:tcPr/>
+          <w:p>
+            <w:pPr>
+              <w:pStyle w:val="Compact"/>
+              <w:jc w:val="left"/>
+            </w:pPr>
+            <w:r>
+              <w:t xml:space="preserve">Neurologic</w:t>
+            </w:r>
+          </w:p>
+        </w:tc>
+        <w:tc>
+          <w:tcPr/>
+          <w:p>
+            <w:pPr>
+              <w:pStyle w:val="Compact"/>
+              <w:jc w:val="left"/>
+            </w:pPr>
+            <w:r>
+              <w:t xml:space="preserve">servizio (terapia)</w:t>
+            </w:r>
+          </w:p>
+        </w:tc>
+      </w:tr>
+      <w:tr>
+        <w:tc>
+          <w:tcPr/>
+          <w:p>
+            <w:pPr>
+              <w:pStyle w:val="Compact"/>
+              <w:jc w:val="left"/>
+            </w:pPr>
+            <w:r>
+              <w:t xml:space="preserve">Cardiodiagnostica</w:t>
+            </w:r>
+          </w:p>
+        </w:tc>
+        <w:tc>
+          <w:tcPr/>
+          <w:p>
+            <w:pPr>
+              <w:pStyle w:val="Compact"/>
+              <w:jc w:val="left"/>
+            </w:pPr>
+            <w:r>
+              <w:t xml:space="preserve">Cardiovascular</w:t>
+            </w:r>
+          </w:p>
+        </w:tc>
+        <w:tc>
+          <w:tcPr/>
+          <w:p>
+            <w:pPr>
+              <w:pStyle w:val="Compact"/>
+              <w:jc w:val="left"/>
+            </w:pPr>
+            <w:r>
+              <w:t xml:space="preserve">servizio (esame)</w:t>
+            </w:r>
+          </w:p>
+        </w:tc>
+      </w:tr>
+      <w:tr>
+        <w:tc>
+          <w:tcPr/>
+          <w:p>
+            <w:pPr>
+              <w:pStyle w:val="Compact"/>
+              <w:jc w:val="left"/>
+            </w:pPr>
+            <w:r>
+              <w:t xml:space="preserve">Cardiologia</w:t>
+            </w:r>
+          </w:p>
+        </w:tc>
+        <w:tc>
+          <w:tcPr/>
+          <w:p>
+            <w:pPr>
+              <w:pStyle w:val="Compact"/>
+              <w:jc w:val="left"/>
+            </w:pPr>
+            <w:r>
+              <w:t xml:space="preserve">Cardiovascular</w:t>
+            </w:r>
+          </w:p>
+        </w:tc>
+        <w:tc>
+          <w:tcPr/>
+          <w:p>
+            <w:pPr>
+              <w:pStyle w:val="Compact"/>
+              <w:jc w:val="left"/>
+            </w:pPr>
+            <w:r>
+              <w:t xml:space="preserve">solo specialità</w:t>
+            </w:r>
+          </w:p>
+        </w:tc>
+      </w:tr>
+      <w:tr>
+        <w:tc>
+          <w:tcPr/>
+          <w:p>
+            <w:pPr>
+              <w:pStyle w:val="Compact"/>
+              <w:jc w:val="left"/>
+            </w:pPr>
+            <w:r>
+              <w:t xml:space="preserve">Chirurgia generale</w:t>
+            </w:r>
+          </w:p>
+        </w:tc>
+        <w:tc>
+          <w:tcPr/>
+          <w:p>
+            <w:pPr>
+              <w:pStyle w:val="Compact"/>
+              <w:jc w:val="left"/>
+            </w:pPr>
+            <w:r>
+              <w:t xml:space="preserve">Surgical</w:t>
+            </w:r>
+          </w:p>
+        </w:tc>
+        <w:tc>
+          <w:tcPr/>
+          <w:p>
+            <w:pPr>
+              <w:pStyle w:val="Compact"/>
+              <w:jc w:val="left"/>
+            </w:pPr>
+            <w:r>
+              <w:t xml:space="preserve">solo specialità</w:t>
+            </w:r>
+          </w:p>
+        </w:tc>
+      </w:tr>
+      <w:tr>
+        <w:tc>
+          <w:tcPr/>
+          <w:p>
+            <w:pPr>
+              <w:pStyle w:val="Compact"/>
+              <w:jc w:val="left"/>
+            </w:pPr>
+            <w:r>
+              <w:t xml:space="preserve">Dermatologia</w:t>
+            </w:r>
+          </w:p>
+        </w:tc>
+        <w:tc>
+          <w:tcPr/>
+          <w:p>
+            <w:pPr>
+              <w:pStyle w:val="Compact"/>
+              <w:jc w:val="left"/>
+            </w:pPr>
+            <w:r>
+              <w:t xml:space="preserve">Dermatology</w:t>
+            </w:r>
+          </w:p>
+        </w:tc>
+        <w:tc>
+          <w:tcPr/>
+          <w:p>
+            <w:pPr>
+              <w:pStyle w:val="Compact"/>
+              <w:jc w:val="left"/>
+            </w:pPr>
+            <w:r>
+              <w:t xml:space="preserve">solo specialità</w:t>
+            </w:r>
+          </w:p>
+        </w:tc>
+      </w:tr>
+      <w:tr>
+        <w:tc>
+          <w:tcPr/>
+          <w:p>
+            <w:pPr>
+              <w:pStyle w:val="Compact"/>
+              <w:jc w:val="left"/>
+            </w:pPr>
+            <w:r>
+              <w:t xml:space="preserve">Diagnostica ecografica</w:t>
+            </w:r>
+          </w:p>
+        </w:tc>
+        <w:tc>
+          <w:tcPr/>
+          <w:p>
+            <w:pPr>
+              <w:pStyle w:val="Compact"/>
+              <w:jc w:val="left"/>
+            </w:pPr>
+            <w:r>
+              <w:t xml:space="preserve">Radiography</w:t>
+            </w:r>
+          </w:p>
+        </w:tc>
+        <w:tc>
+          <w:tcPr/>
+          <w:p>
+            <w:pPr>
+              <w:pStyle w:val="Compact"/>
+              <w:jc w:val="left"/>
+            </w:pPr>
+            <w:r>
+              <w:t xml:space="preserve">servizio (esame)</w:t>
+            </w:r>
+          </w:p>
+        </w:tc>
+      </w:tr>
+      <w:tr>
+        <w:tc>
+          <w:tcPr/>
+          <w:p>
+            <w:pPr>
+              <w:pStyle w:val="Compact"/>
+              <w:jc w:val="left"/>
+            </w:pPr>
+            <w:r>
+              <w:t xml:space="preserve">Dipendenze</w:t>
+            </w:r>
+          </w:p>
+        </w:tc>
+        <w:tc>
+          <w:tcPr/>
+          <w:p>
+            <w:pPr>
+              <w:pStyle w:val="Compact"/>
+              <w:jc w:val="left"/>
+            </w:pPr>
+            <w:r>
+              <w:t xml:space="preserve">Psychiatric</w:t>
+            </w:r>
+          </w:p>
+        </w:tc>
+        <w:tc>
+          <w:tcPr/>
+          <w:p>
+            <w:pPr>
+              <w:pStyle w:val="Compact"/>
+              <w:jc w:val="left"/>
+            </w:pPr>
+            <w:r>
+              <w:t xml:space="preserve">condizione trattata</w:t>
+            </w:r>
+          </w:p>
+        </w:tc>
+      </w:tr>
+      <w:tr>
+        <w:tc>
+          <w:tcPr/>
+          <w:p>
+            <w:pPr>
+              <w:pStyle w:val="Compact"/>
+              <w:jc w:val="left"/>
+            </w:pPr>
+            <w:r>
+              <w:t xml:space="preserve">Disturbi d'ansia</w:t>
+            </w:r>
+          </w:p>
+        </w:tc>
+        <w:tc>
+          <w:tcPr/>
+          <w:p>
+            <w:pPr>
+              <w:pStyle w:val="Compact"/>
+              <w:jc w:val="left"/>
+            </w:pPr>
+            <w:r>
+              <w:t xml:space="preserve">Psychiatric</w:t>
+            </w:r>
+          </w:p>
+        </w:tc>
+        <w:tc>
+          <w:tcPr/>
+          <w:p>
+            <w:pPr>
+              <w:pStyle w:val="Compact"/>
+              <w:jc w:val="left"/>
+            </w:pPr>
+            <w:r>
+              <w:t xml:space="preserve">condizione trattata</w:t>
+            </w:r>
+          </w:p>
+        </w:tc>
+      </w:tr>
+      <w:tr>
+        <w:tc>
+          <w:tcPr/>
+          <w:p>
+            <w:pPr>
+              <w:pStyle w:val="Compact"/>
+              <w:jc w:val="left"/>
+            </w:pPr>
+            <w:r>
+              <w:t xml:space="preserve">Disturbi del sonno</w:t>
+            </w:r>
+          </w:p>
+        </w:tc>
+        <w:tc>
+          <w:tcPr/>
+          <w:p>
+            <w:pPr>
+              <w:pStyle w:val="Compact"/>
+              <w:jc w:val="left"/>
+            </w:pPr>
+            <w:r>
+              <w:t xml:space="preserve">Psychiatric, Neurologic</w:t>
+            </w:r>
+          </w:p>
+        </w:tc>
+        <w:tc>
+          <w:tcPr/>
+          <w:p>
+            <w:pPr>
+              <w:pStyle w:val="Compact"/>
+              <w:jc w:val="left"/>
+            </w:pPr>
+            <w:r>
+              <w:t xml:space="preserve">condizione trattata</w:t>
+            </w:r>
+          </w:p>
+        </w:tc>
+      </w:tr>
+      <w:tr>
+        <w:tc>
+          <w:tcPr/>
+          <w:p>
+            <w:pPr>
+              <w:pStyle w:val="Compact"/>
+              <w:jc w:val="left"/>
+            </w:pPr>
+            <w:r>
+              <w:t xml:space="preserve">Disturbi dell'umore e depressione</w:t>
+            </w:r>
+          </w:p>
+        </w:tc>
+        <w:tc>
+          <w:tcPr/>
+          <w:p>
+            <w:pPr>
+              <w:pStyle w:val="Compact"/>
+              <w:jc w:val="left"/>
+            </w:pPr>
+            <w:r>
+              <w:t xml:space="preserve">Psychiatric</w:t>
+            </w:r>
+          </w:p>
+        </w:tc>
+        <w:tc>
+          <w:tcPr/>
+          <w:p>
+            <w:pPr>
+              <w:pStyle w:val="Compact"/>
+              <w:jc w:val="left"/>
+            </w:pPr>
+            <w:r>
+              <w:t xml:space="preserve">condizione trattata</w:t>
+            </w:r>
+          </w:p>
+        </w:tc>
+      </w:tr>
+      <w:tr>
+        <w:tc>
+          <w:tcPr/>
+          <w:p>
+            <w:pPr>
+              <w:pStyle w:val="Compact"/>
+              <w:jc w:val="left"/>
+            </w:pPr>
+            <w:r>
+              <w:t xml:space="preserve">Disturbi della nutrizione e dell'alimentazione (DNA)</w:t>
+            </w:r>
+          </w:p>
+        </w:tc>
+        <w:tc>
+          <w:tcPr/>
+          <w:p>
+            <w:pPr>
+              <w:pStyle w:val="Compact"/>
+              <w:jc w:val="left"/>
+            </w:pPr>
+            <w:r>
+              <w:t xml:space="preserve">Psychiatric, DietNutrition</w:t>
+            </w:r>
+          </w:p>
+        </w:tc>
+        <w:tc>
+          <w:tcPr/>
+          <w:p>
+            <w:pPr>
+              <w:pStyle w:val="Compact"/>
+              <w:jc w:val="left"/>
+            </w:pPr>
+            <w:r>
+              <w:t xml:space="preserve">condizione trattata</w:t>
+            </w:r>
+          </w:p>
+        </w:tc>
+      </w:tr>
+      <w:tr>
+        <w:tc>
+          <w:tcPr/>
+          <w:p>
+            <w:pPr>
+              <w:pStyle w:val="Compact"/>
+              <w:jc w:val="left"/>
+            </w:pPr>
+            <w:r>
+              <w:t xml:space="preserve">Disturbi della personalità</w:t>
+            </w:r>
+          </w:p>
+        </w:tc>
+        <w:tc>
+          <w:tcPr/>
+          <w:p>
+            <w:pPr>
+              <w:pStyle w:val="Compact"/>
+              <w:jc w:val="left"/>
+            </w:pPr>
+            <w:r>
+              <w:t xml:space="preserve">Psychiatric</w:t>
+            </w:r>
+          </w:p>
+        </w:tc>
+        <w:tc>
+          <w:tcPr/>
+          <w:p>
+            <w:pPr>
+              <w:pStyle w:val="Compact"/>
+              <w:jc w:val="left"/>
+            </w:pPr>
+            <w:r>
+              <w:t xml:space="preserve">condizione trattata</w:t>
+            </w:r>
+          </w:p>
+        </w:tc>
+      </w:tr>
+      <w:tr>
+        <w:tc>
+          <w:tcPr/>
+          <w:p>
+            <w:pPr>
+              <w:pStyle w:val="Compact"/>
+              <w:jc w:val="left"/>
+            </w:pPr>
+            <w:r>
+              <w:t xml:space="preserve">Disturbo ossessivo compulsivo</w:t>
+            </w:r>
+          </w:p>
+        </w:tc>
+        <w:tc>
+          <w:tcPr/>
+          <w:p>
+            <w:pPr>
+              <w:pStyle w:val="Compact"/>
+              <w:jc w:val="left"/>
+            </w:pPr>
+            <w:r>
+              <w:t xml:space="preserve">Psychiatric</w:t>
+            </w:r>
+          </w:p>
+        </w:tc>
+        <w:tc>
+          <w:tcPr/>
+          <w:p>
+            <w:pPr>
+              <w:pStyle w:val="Compact"/>
+              <w:jc w:val="left"/>
+            </w:pPr>
+            <w:r>
+              <w:t xml:space="preserve">condizione trattata</w:t>
+            </w:r>
+          </w:p>
+        </w:tc>
+      </w:tr>
+      <w:tr>
+        <w:tc>
+          <w:tcPr/>
+          <w:p>
+            <w:pPr>
+              <w:pStyle w:val="Compact"/>
+              <w:jc w:val="left"/>
+            </w:pPr>
+            <w:r>
+              <w:t xml:space="preserve">Disturbo post traumatico da stress</w:t>
+            </w:r>
+          </w:p>
+        </w:tc>
+        <w:tc>
+          <w:tcPr/>
+          <w:p>
+            <w:pPr>
+              <w:pStyle w:val="Compact"/>
+              <w:jc w:val="left"/>
+            </w:pPr>
+            <w:r>
+              <w:t xml:space="preserve">Psychiatric</w:t>
+            </w:r>
+          </w:p>
+        </w:tc>
+        <w:tc>
+          <w:tcPr/>
+          <w:p>
+            <w:pPr>
+              <w:pStyle w:val="Compact"/>
+              <w:jc w:val="left"/>
+            </w:pPr>
+            <w:r>
+              <w:t xml:space="preserve">condizione trattata</w:t>
+            </w:r>
+          </w:p>
+        </w:tc>
+      </w:tr>
+      <w:tr>
+        <w:tc>
+          <w:tcPr/>
+          <w:p>
+            <w:pPr>
+              <w:pStyle w:val="Compact"/>
+              <w:jc w:val="left"/>
+            </w:pPr>
+            <w:r>
+              <w:t xml:space="preserve">Elettroencefalografia</w:t>
+            </w:r>
+          </w:p>
+        </w:tc>
+        <w:tc>
+          <w:tcPr/>
+          <w:p>
+            <w:pPr>
+              <w:pStyle w:val="Compact"/>
+              <w:jc w:val="left"/>
+            </w:pPr>
+            <w:r>
+              <w:t xml:space="preserve">Neurologic</w:t>
+            </w:r>
+          </w:p>
+        </w:tc>
+        <w:tc>
+          <w:tcPr/>
+          <w:p>
+            <w:pPr>
+              <w:pStyle w:val="Compact"/>
+              <w:jc w:val="left"/>
+            </w:pPr>
+            <w:r>
+              <w:t xml:space="preserve">servizio (esame)</w:t>
+            </w:r>
+          </w:p>
+        </w:tc>
+      </w:tr>
+      <w:tr>
+        <w:tc>
+          <w:tcPr/>
+          <w:p>
+            <w:pPr>
+              <w:pStyle w:val="Compact"/>
+              <w:jc w:val="left"/>
+            </w:pPr>
+            <w:r>
+              <w:t xml:space="preserve">Elettromiografia</w:t>
+            </w:r>
+          </w:p>
+        </w:tc>
+        <w:tc>
+          <w:tcPr/>
+          <w:p>
+            <w:pPr>
+              <w:pStyle w:val="Compact"/>
+              <w:jc w:val="left"/>
+            </w:pPr>
+            <w:r>
+              <w:t xml:space="preserve">Neurologic</w:t>
+            </w:r>
+          </w:p>
+        </w:tc>
+        <w:tc>
+          <w:tcPr/>
+          <w:p>
+            <w:pPr>
+              <w:pStyle w:val="Compact"/>
+              <w:jc w:val="left"/>
+            </w:pPr>
+            <w:r>
+              <w:t xml:space="preserve">servizio (esame)</w:t>
+            </w:r>
+          </w:p>
+        </w:tc>
+      </w:tr>
+      <w:tr>
+        <w:tc>
+          <w:tcPr/>
+          <w:p>
+            <w:pPr>
+              <w:pStyle w:val="Compact"/>
+              <w:jc w:val="left"/>
+            </w:pPr>
+            <w:r>
+              <w:t xml:space="preserve">Endrocrinologia</w:t>
+            </w:r>
+          </w:p>
+        </w:tc>
+        <w:tc>
+          <w:tcPr/>
+          <w:p>
+            <w:pPr>
+              <w:pStyle w:val="Compact"/>
+              <w:jc w:val="left"/>
+            </w:pPr>
+            <w:r>
+              <w:t xml:space="preserve">Endocrine</w:t>
+            </w:r>
+          </w:p>
+        </w:tc>
+        <w:tc>
+          <w:tcPr/>
+          <w:p>
+            <w:pPr>
+              <w:pStyle w:val="Compact"/>
+              <w:jc w:val="left"/>
+            </w:pPr>
+            <w:r>
+              <w:t xml:space="preserve">solo specialità</w:t>
+            </w:r>
+          </w:p>
+        </w:tc>
+      </w:tr>
+      <w:tr>
+        <w:tc>
+          <w:tcPr/>
+          <w:p>
+            <w:pPr>
+              <w:pStyle w:val="Compact"/>
+              <w:jc w:val="left"/>
+            </w:pPr>
+            <w:r>
+              <w:t xml:space="preserve">Flebologia</w:t>
+            </w:r>
+          </w:p>
+        </w:tc>
+        <w:tc>
+          <w:tcPr/>
+          <w:p>
+            <w:pPr>
+              <w:pStyle w:val="Compact"/>
+              <w:jc w:val="left"/>
+            </w:pPr>
+            <w:r>
+              <w:t xml:space="preserve">Cardiovascular</w:t>
+            </w:r>
+          </w:p>
+        </w:tc>
+        <w:tc>
+          <w:tcPr/>
+          <w:p>
+            <w:pPr>
+              <w:pStyle w:val="Compact"/>
+              <w:jc w:val="left"/>
+            </w:pPr>
+            <w:r>
+              <w:t xml:space="preserve">solo specialità</w:t>
+            </w:r>
+          </w:p>
+        </w:tc>
+      </w:tr>
+      <w:tr>
+        <w:tc>
+          <w:tcPr/>
+          <w:p>
+            <w:pPr>
+              <w:pStyle w:val="Compact"/>
+              <w:jc w:val="left"/>
+            </w:pPr>
+            <w:r>
+              <w:t xml:space="preserve">Gastroentereologia</w:t>
+            </w:r>
+          </w:p>
+        </w:tc>
+        <w:tc>
+          <w:tcPr/>
+          <w:p>
+            <w:pPr>
+              <w:pStyle w:val="Compact"/>
+              <w:jc w:val="left"/>
+            </w:pPr>
+            <w:r>
+              <w:t xml:space="preserve">Gastroenterologic</w:t>
+            </w:r>
+          </w:p>
+        </w:tc>
+        <w:tc>
+          <w:tcPr/>
+          <w:p>
+            <w:pPr>
+              <w:pStyle w:val="Compact"/>
+              <w:jc w:val="left"/>
+            </w:pPr>
+            <w:r>
+              <w:t xml:space="preserve">solo specialità</w:t>
+            </w:r>
+          </w:p>
+        </w:tc>
+      </w:tr>
+      <w:tr>
+        <w:tc>
+          <w:tcPr/>
+          <w:p>
+            <w:pPr>
+              <w:pStyle w:val="Compact"/>
+              <w:jc w:val="left"/>
+            </w:pPr>
+            <w:r>
+              <w:t xml:space="preserve">Ginecologia</w:t>
+            </w:r>
+          </w:p>
+        </w:tc>
+        <w:tc>
+          <w:tcPr/>
+          <w:p>
+            <w:pPr>
+              <w:pStyle w:val="Compact"/>
+              <w:jc w:val="left"/>
+            </w:pPr>
+            <w:r>
+              <w:t xml:space="preserve">Gynecologic</w:t>
+            </w:r>
+          </w:p>
+        </w:tc>
+        <w:tc>
+          <w:tcPr/>
+          <w:p>
+            <w:pPr>
+              <w:pStyle w:val="Compact"/>
+              <w:jc w:val="left"/>
+            </w:pPr>
+            <w:r>
+              <w:t xml:space="preserve">solo specialità</w:t>
+            </w:r>
+          </w:p>
+        </w:tc>
+      </w:tr>
+      <w:tr>
+        <w:tc>
+          <w:tcPr/>
+          <w:p>
+            <w:pPr>
+              <w:pStyle w:val="Compact"/>
+              <w:jc w:val="left"/>
+            </w:pPr>
+            <w:r>
+              <w:t xml:space="preserve">Laboratorio analisi</w:t>
+            </w:r>
+          </w:p>
+        </w:tc>
+        <w:tc>
+          <w:tcPr/>
+          <w:p>
+            <w:pPr>
+              <w:pStyle w:val="Compact"/>
+              <w:jc w:val="left"/>
+            </w:pPr>
+            <w:r>
+              <w:t xml:space="preserve">LaboratoryScience</w:t>
+            </w:r>
+          </w:p>
+        </w:tc>
+        <w:tc>
+          <w:tcPr/>
+          <w:p>
+            <w:pPr>
+              <w:pStyle w:val="Compact"/>
+              <w:jc w:val="left"/>
+            </w:pPr>
+            <w:r>
+              <w:t xml:space="preserve">solo specialità</w:t>
+            </w:r>
+          </w:p>
+        </w:tc>
+      </w:tr>
+      <w:tr>
+        <w:tc>
+          <w:tcPr/>
+          <w:p>
+            <w:pPr>
+              <w:pStyle w:val="Compact"/>
+              <w:jc w:val="left"/>
+            </w:pPr>
+            <w:r>
+              <w:t xml:space="preserve">MOC</w:t>
+            </w:r>
+          </w:p>
+        </w:tc>
+        <w:tc>
+          <w:tcPr/>
+          <w:p>
+            <w:pPr>
+              <w:pStyle w:val="Compact"/>
+              <w:jc w:val="left"/>
+            </w:pPr>
+            <w:r>
+              <w:t xml:space="preserve">Radiography</w:t>
+            </w:r>
+          </w:p>
+        </w:tc>
+        <w:tc>
+          <w:tcPr/>
+          <w:p>
+            <w:pPr>
+              <w:pStyle w:val="Compact"/>
+              <w:jc w:val="left"/>
+            </w:pPr>
+            <w:r>
+              <w:t xml:space="preserve">servizio (esame)</w:t>
+            </w:r>
+          </w:p>
+        </w:tc>
+      </w:tr>
+      <w:tr>
+        <w:tc>
+          <w:tcPr/>
+          <w:p>
+            <w:pPr>
+              <w:pStyle w:val="Compact"/>
+              <w:jc w:val="left"/>
+            </w:pPr>
+            <w:r>
+              <w:t xml:space="preserve">Maxillofacciale</w:t>
+            </w:r>
+          </w:p>
+        </w:tc>
+        <w:tc>
+          <w:tcPr/>
+          <w:p>
+            <w:pPr>
+              <w:pStyle w:val="Compact"/>
+              <w:jc w:val="left"/>
+            </w:pPr>
+            <w:r>
+              <w:t xml:space="preserve">Surgical</w:t>
+            </w:r>
+          </w:p>
+        </w:tc>
+        <w:tc>
+          <w:tcPr/>
+          <w:p>
+            <w:pPr>
+              <w:pStyle w:val="Compact"/>
+              <w:jc w:val="left"/>
+            </w:pPr>
+            <w:r>
+              <w:t xml:space="preserve">solo specialità</w:t>
+            </w:r>
+          </w:p>
+        </w:tc>
+      </w:tr>
+      <w:tr>
+        <w:tc>
+          <w:tcPr/>
+          <w:p>
+            <w:pPr>
+              <w:pStyle w:val="Compact"/>
+              <w:jc w:val="left"/>
+            </w:pPr>
+            <w:r>
+              <w:t xml:space="preserve">Medicina dello Sport</w:t>
+            </w:r>
+          </w:p>
+        </w:tc>
+        <w:tc>
+          <w:tcPr/>
+          <w:p>
+            <w:pPr>
+              <w:pStyle w:val="Compact"/>
+              <w:jc w:val="left"/>
+            </w:pPr>
+            <w:r>
+              <w:t xml:space="preserve">Musculoskeletal</w:t>
+            </w:r>
+          </w:p>
+        </w:tc>
+        <w:tc>
+          <w:tcPr/>
+          <w:p>
+            <w:pPr>
+              <w:pStyle w:val="Compact"/>
+              <w:jc w:val="left"/>
+            </w:pPr>
+            <w:r>
+              <w:t xml:space="preserve">solo specialità</w:t>
+            </w:r>
+          </w:p>
+        </w:tc>
+      </w:tr>
+      <w:tr>
+        <w:tc>
+          <w:tcPr/>
+          <w:p>
+            <w:pPr>
+              <w:pStyle w:val="Compact"/>
+              <w:jc w:val="left"/>
+            </w:pPr>
+            <w:r>
+              <w:t xml:space="preserve">Nefrologia</w:t>
+            </w:r>
+          </w:p>
+        </w:tc>
+        <w:tc>
+          <w:tcPr/>
+          <w:p>
+            <w:pPr>
+              <w:pStyle w:val="Compact"/>
+              <w:jc w:val="left"/>
+            </w:pPr>
+            <w:r>
+              <w:t xml:space="preserve">Renal</w:t>
+            </w:r>
+          </w:p>
+        </w:tc>
+        <w:tc>
+          <w:tcPr/>
+          <w:p>
+            <w:pPr>
+              <w:pStyle w:val="Compact"/>
+              <w:jc w:val="left"/>
+            </w:pPr>
+            <w:r>
+              <w:t xml:space="preserve">solo specialità</w:t>
+            </w:r>
+          </w:p>
+        </w:tc>
+      </w:tr>
+      <w:tr>
+        <w:tc>
+          <w:tcPr/>
+          <w:p>
+            <w:pPr>
+              <w:pStyle w:val="Compact"/>
+              <w:jc w:val="left"/>
+            </w:pPr>
+            <w:r>
+              <w:t xml:space="preserve">Neurochirurgia</w:t>
+            </w:r>
+          </w:p>
+        </w:tc>
+        <w:tc>
+          <w:tcPr/>
+          <w:p>
+            <w:pPr>
+              <w:pStyle w:val="Compact"/>
+              <w:jc w:val="left"/>
+            </w:pPr>
+            <w:r>
+              <w:t xml:space="preserve">Surgical, Neurologic</w:t>
+            </w:r>
+          </w:p>
+        </w:tc>
+        <w:tc>
+          <w:tcPr/>
+          <w:p>
+            <w:pPr>
+              <w:pStyle w:val="Compact"/>
+              <w:jc w:val="left"/>
+            </w:pPr>
+            <w:r>
+              <w:t xml:space="preserve">solo specialità</w:t>
+            </w:r>
+          </w:p>
+        </w:tc>
+      </w:tr>
+      <w:tr>
+        <w:tc>
+          <w:tcPr/>
+          <w:p>
+            <w:pPr>
+              <w:pStyle w:val="Compact"/>
+              <w:jc w:val="left"/>
+            </w:pPr>
+            <w:r>
+              <w:t xml:space="preserve">Neurologia</w:t>
+            </w:r>
+          </w:p>
+        </w:tc>
+        <w:tc>
+          <w:tcPr/>
+          <w:p>
+            <w:pPr>
+              <w:pStyle w:val="Compact"/>
+              <w:jc w:val="left"/>
+            </w:pPr>
+            <w:r>
+              <w:t xml:space="preserve">Neurologic</w:t>
+            </w:r>
+          </w:p>
+        </w:tc>
+        <w:tc>
+          <w:tcPr/>
+          <w:p>
+            <w:pPr>
+              <w:pStyle w:val="Compact"/>
+              <w:jc w:val="left"/>
+            </w:pPr>
+            <w:r>
+              <w:t xml:space="preserve">solo specialità</w:t>
+            </w:r>
+          </w:p>
+        </w:tc>
+      </w:tr>
+      <w:tr>
+        <w:tc>
+          <w:tcPr/>
+          <w:p>
+            <w:pPr>
+              <w:pStyle w:val="Compact"/>
+              <w:jc w:val="left"/>
+            </w:pPr>
+            <w:r>
+              <w:t xml:space="preserve">Oculistica</w:t>
+            </w:r>
+          </w:p>
+        </w:tc>
+        <w:tc>
+          <w:tcPr/>
+          <w:p>
+            <w:pPr>
+              <w:pStyle w:val="Compact"/>
+              <w:jc w:val="left"/>
+            </w:pPr>
+            <w:r>
+              <w:t xml:space="preserve">Optometric</w:t>
+            </w:r>
+          </w:p>
+        </w:tc>
+        <w:tc>
+          <w:tcPr/>
+          <w:p>
+            <w:pPr>
+              <w:pStyle w:val="Compact"/>
+              <w:jc w:val="left"/>
+            </w:pPr>
+            <w:r>
+              <w:t xml:space="preserve">solo specialità</w:t>
+            </w:r>
+          </w:p>
+        </w:tc>
+      </w:tr>
+      <w:tr>
+        <w:tc>
+          <w:tcPr/>
+          <w:p>
+            <w:pPr>
+              <w:pStyle w:val="Compact"/>
+              <w:jc w:val="left"/>
+            </w:pPr>
+            <w:r>
+              <w:t xml:space="preserve">Oncologia</w:t>
+            </w:r>
+          </w:p>
+        </w:tc>
+        <w:tc>
+          <w:tcPr/>
+          <w:p>
+            <w:pPr>
+              <w:pStyle w:val="Compact"/>
+              <w:jc w:val="left"/>
+            </w:pPr>
+            <w:r>
+              <w:t xml:space="preserve">Oncologic</w:t>
+            </w:r>
+          </w:p>
+        </w:tc>
+        <w:tc>
+          <w:tcPr/>
+          <w:p>
+            <w:pPr>
+              <w:pStyle w:val="Compact"/>
+              <w:jc w:val="left"/>
+            </w:pPr>
+            <w:r>
+              <w:t xml:space="preserve">solo specialità</w:t>
+            </w:r>
+          </w:p>
+        </w:tc>
+      </w:tr>
+      <w:tr>
+        <w:tc>
+          <w:tcPr/>
+          <w:p>
+            <w:pPr>
+              <w:pStyle w:val="Compact"/>
+              <w:jc w:val="left"/>
+            </w:pPr>
+            <w:r>
+              <w:t xml:space="preserve">Ortopedia</w:t>
+            </w:r>
+          </w:p>
+        </w:tc>
+        <w:tc>
+          <w:tcPr/>
+          <w:p>
+            <w:pPr>
+              <w:pStyle w:val="Compact"/>
+              <w:jc w:val="left"/>
+            </w:pPr>
+            <w:r>
+              <w:t xml:space="preserve">Musculoskeletal</w:t>
+            </w:r>
+          </w:p>
+        </w:tc>
+        <w:tc>
+          <w:tcPr/>
+          <w:p>
+            <w:pPr>
+              <w:pStyle w:val="Compact"/>
+              <w:jc w:val="left"/>
+            </w:pPr>
+            <w:r>
+              <w:t xml:space="preserve">solo specialità</w:t>
+            </w:r>
+          </w:p>
+        </w:tc>
+      </w:tr>
+      <w:tr>
+        <w:tc>
+          <w:tcPr/>
+          <w:p>
+            <w:pPr>
+              <w:pStyle w:val="Compact"/>
+              <w:jc w:val="left"/>
+            </w:pPr>
+            <w:r>
+              <w:t xml:space="preserve">Otorinolaringoiatria</w:t>
+            </w:r>
+          </w:p>
+        </w:tc>
+        <w:tc>
+          <w:tcPr/>
+          <w:p>
+            <w:pPr>
+              <w:pStyle w:val="Compact"/>
+              <w:jc w:val="left"/>
+            </w:pPr>
+            <w:r>
+              <w:t xml:space="preserve">Otolaryngologic</w:t>
+            </w:r>
+          </w:p>
+        </w:tc>
+        <w:tc>
+          <w:tcPr/>
+          <w:p>
+            <w:pPr>
+              <w:pStyle w:val="Compact"/>
+              <w:jc w:val="left"/>
+            </w:pPr>
+            <w:r>
+              <w:t xml:space="preserve">solo specialità</w:t>
+            </w:r>
+          </w:p>
+        </w:tc>
+      </w:tr>
+      <w:tr>
+        <w:tc>
+          <w:tcPr/>
+          <w:p>
+            <w:pPr>
+              <w:pStyle w:val="Compact"/>
+              <w:jc w:val="left"/>
+            </w:pPr>
+            <w:r>
+              <w:t xml:space="preserve">Pneumologia</w:t>
+            </w:r>
+          </w:p>
+        </w:tc>
+        <w:tc>
+          <w:tcPr/>
+          <w:p>
+            <w:pPr>
+              <w:pStyle w:val="Compact"/>
+              <w:jc w:val="left"/>
+            </w:pPr>
+            <w:r>
+              <w:t xml:space="preserve">Pulmonary</w:t>
+            </w:r>
+          </w:p>
+        </w:tc>
+        <w:tc>
+          <w:tcPr/>
+          <w:p>
+            <w:pPr>
+              <w:pStyle w:val="Compact"/>
+              <w:jc w:val="left"/>
+            </w:pPr>
+            <w:r>
+              <w:t xml:space="preserve">solo specialità</w:t>
+            </w:r>
+          </w:p>
+        </w:tc>
+      </w:tr>
+      <w:tr>
+        <w:tc>
+          <w:tcPr/>
+          <w:p>
+            <w:pPr>
+              <w:pStyle w:val="Compact"/>
+              <w:jc w:val="left"/>
+            </w:pPr>
+            <w:r>
+              <w:t xml:space="preserve">Podologia</w:t>
+            </w:r>
+          </w:p>
+        </w:tc>
+        <w:tc>
+          <w:tcPr/>
+          <w:p>
+            <w:pPr>
+              <w:pStyle w:val="Compact"/>
+              <w:jc w:val="left"/>
+            </w:pPr>
+            <w:r>
+              <w:t xml:space="preserve">Podiatric</w:t>
+            </w:r>
+          </w:p>
+        </w:tc>
+        <w:tc>
+          <w:tcPr/>
+          <w:p>
+            <w:pPr>
+              <w:pStyle w:val="Compact"/>
+              <w:jc w:val="left"/>
+            </w:pPr>
+            <w:r>
+              <w:t xml:space="preserve">solo specialità</w:t>
+            </w:r>
+          </w:p>
+        </w:tc>
+      </w:tr>
+      <w:tr>
+        <w:tc>
+          <w:tcPr/>
+          <w:p>
+            <w:pPr>
+              <w:pStyle w:val="Compact"/>
+              <w:jc w:val="left"/>
+            </w:pPr>
+            <w:r>
+              <w:t xml:space="preserve">Psicogeriatria</w:t>
+            </w:r>
+          </w:p>
+        </w:tc>
+        <w:tc>
+          <w:tcPr/>
+          <w:p>
+            <w:pPr>
+              <w:pStyle w:val="Compact"/>
+              <w:jc w:val="left"/>
+            </w:pPr>
+            <w:r>
+              <w:t xml:space="preserve">Psychiatric, Geriatric</w:t>
+            </w:r>
+          </w:p>
+        </w:tc>
+        <w:tc>
+          <w:tcPr/>
+          <w:p>
+            <w:pPr>
+              <w:pStyle w:val="Compact"/>
+              <w:jc w:val="left"/>
+            </w:pPr>
+            <w:r>
+              <w:t xml:space="preserve">solo specialità</w:t>
+            </w:r>
+          </w:p>
+        </w:tc>
+      </w:tr>
+      <w:tr>
+        <w:tc>
+          <w:tcPr/>
+          <w:p>
+            <w:pPr>
+              <w:pStyle w:val="Compact"/>
+              <w:jc w:val="left"/>
+            </w:pPr>
+            <w:r>
+              <w:t xml:space="preserve">Psicosi</w:t>
+            </w:r>
+          </w:p>
+        </w:tc>
+        <w:tc>
+          <w:tcPr/>
+          <w:p>
+            <w:pPr>
+              <w:pStyle w:val="Compact"/>
+              <w:jc w:val="left"/>
+            </w:pPr>
+            <w:r>
+              <w:t xml:space="preserve">Psychiatric</w:t>
+            </w:r>
+          </w:p>
+        </w:tc>
+        <w:tc>
+          <w:tcPr/>
+          <w:p>
+            <w:pPr>
+              <w:pStyle w:val="Compact"/>
+              <w:jc w:val="left"/>
+            </w:pPr>
+            <w:r>
+              <w:t xml:space="preserve">condizione trattata</w:t>
+            </w:r>
+          </w:p>
+        </w:tc>
+      </w:tr>
+      <w:tr>
+        <w:tc>
+          <w:tcPr/>
+          <w:p>
+            <w:pPr>
+              <w:pStyle w:val="Compact"/>
+              <w:jc w:val="left"/>
+            </w:pPr>
+            <w:r>
+              <w:t xml:space="preserve">Radiologia convenzionale</w:t>
+            </w:r>
+          </w:p>
+        </w:tc>
+        <w:tc>
+          <w:tcPr/>
+          <w:p>
+            <w:pPr>
+              <w:pStyle w:val="Compact"/>
+              <w:jc w:val="left"/>
+            </w:pPr>
+            <w:r>
+              <w:t xml:space="preserve">Radiography</w:t>
+            </w:r>
+          </w:p>
+        </w:tc>
+        <w:tc>
+          <w:tcPr/>
+          <w:p>
+            <w:pPr>
+              <w:pStyle w:val="Compact"/>
+              <w:jc w:val="left"/>
+            </w:pPr>
+            <w:r>
+              <w:t xml:space="preserve">servizio (esame)</w:t>
+            </w:r>
+          </w:p>
+        </w:tc>
+      </w:tr>
+      <w:tr>
+        <w:tc>
+          <w:tcPr/>
+          <w:p>
+            <w:pPr>
+              <w:pStyle w:val="Compact"/>
+              <w:jc w:val="left"/>
+            </w:pPr>
+            <w:r>
+              <w:t xml:space="preserve">Reumatologia</w:t>
+            </w:r>
+          </w:p>
+        </w:tc>
+        <w:tc>
+          <w:tcPr/>
+          <w:p>
+            <w:pPr>
+              <w:pStyle w:val="Compact"/>
+              <w:jc w:val="left"/>
+            </w:pPr>
+            <w:r>
+              <w:t xml:space="preserve">Rheumatologic</w:t>
+            </w:r>
+          </w:p>
+        </w:tc>
+        <w:tc>
+          <w:tcPr/>
+          <w:p>
+            <w:pPr>
+              <w:pStyle w:val="Compact"/>
+              <w:jc w:val="left"/>
+            </w:pPr>
+            <w:r>
+              <w:t xml:space="preserve">solo specialità</w:t>
+            </w:r>
+          </w:p>
+        </w:tc>
+      </w:tr>
+      <w:tr>
+        <w:tc>
+          <w:tcPr/>
+          <w:p>
+            <w:pPr>
+              <w:pStyle w:val="Compact"/>
+              <w:jc w:val="left"/>
+            </w:pPr>
+            <w:r>
+              <w:t xml:space="preserve">Riabilitazione cardiologica</w:t>
+            </w:r>
+          </w:p>
+        </w:tc>
+        <w:tc>
+          <w:tcPr/>
+          <w:p>
+            <w:pPr>
+              <w:pStyle w:val="Compact"/>
+              <w:jc w:val="left"/>
+            </w:pPr>
+            <w:r>
+              <w:t xml:space="preserve">Physiotherapy, Cardiovascular</w:t>
+            </w:r>
+          </w:p>
+        </w:tc>
+        <w:tc>
+          <w:tcPr/>
+          <w:p>
+            <w:pPr>
+              <w:pStyle w:val="Compact"/>
+              <w:jc w:val="left"/>
+            </w:pPr>
+            <w:r>
+              <w:t xml:space="preserve">servizio (terapia)</w:t>
+            </w:r>
+          </w:p>
+        </w:tc>
+      </w:tr>
+      <w:tr>
+        <w:tc>
+          <w:tcPr/>
+          <w:p>
+            <w:pPr>
+              <w:pStyle w:val="Compact"/>
+              <w:jc w:val="left"/>
+            </w:pPr>
+            <w:r>
+              <w:t xml:space="preserve">Riabilitazione gravi cerebrolesioni</w:t>
+            </w:r>
+          </w:p>
+        </w:tc>
+        <w:tc>
+          <w:tcPr/>
+          <w:p>
+            <w:pPr>
+              <w:pStyle w:val="Compact"/>
+              <w:jc w:val="left"/>
+            </w:pPr>
+            <w:r>
+              <w:t xml:space="preserve">Physiotherapy, Neurologic</w:t>
+            </w:r>
+          </w:p>
+        </w:tc>
+        <w:tc>
+          <w:tcPr/>
+          <w:p>
+            <w:pPr>
+              <w:pStyle w:val="Compact"/>
+              <w:jc w:val="left"/>
+            </w:pPr>
+            <w:r>
+              <w:t xml:space="preserve">servizio (terapia)</w:t>
+            </w:r>
+          </w:p>
+        </w:tc>
+      </w:tr>
+      <w:tr>
+        <w:tc>
+          <w:tcPr/>
+          <w:p>
+            <w:pPr>
+              <w:pStyle w:val="Compact"/>
+              <w:jc w:val="left"/>
+            </w:pPr>
+            <w:r>
+              <w:t xml:space="preserve">Riabilitazione in età evolutiva</w:t>
+            </w:r>
+          </w:p>
+        </w:tc>
+        <w:tc>
+          <w:tcPr/>
+          <w:p>
+            <w:pPr>
+              <w:pStyle w:val="Compact"/>
+              <w:jc w:val="left"/>
+            </w:pPr>
+            <w:r>
+              <w:t xml:space="preserve">Physiotherapy, Pediatric</w:t>
+            </w:r>
+          </w:p>
+        </w:tc>
+        <w:tc>
+          <w:tcPr/>
+          <w:p>
+            <w:pPr>
+              <w:pStyle w:val="Compact"/>
+              <w:jc w:val="left"/>
+            </w:pPr>
+            <w:r>
+              <w:t xml:space="preserve">servizio (terapia)</w:t>
+            </w:r>
+          </w:p>
+        </w:tc>
+      </w:tr>
+      <w:tr>
+        <w:tc>
+          <w:tcPr/>
+          <w:p>
+            <w:pPr>
+              <w:pStyle w:val="Compact"/>
+              <w:jc w:val="left"/>
+            </w:pPr>
+            <w:r>
+              <w:t xml:space="preserve">Riabilitazione metabolica</w:t>
+            </w:r>
+          </w:p>
+        </w:tc>
+        <w:tc>
+          <w:tcPr/>
+          <w:p>
+            <w:pPr>
+              <w:pStyle w:val="Compact"/>
+              <w:jc w:val="left"/>
+            </w:pPr>
+            <w:r>
+              <w:t xml:space="preserve">Physiotherapy, Endocrine</w:t>
+            </w:r>
+          </w:p>
+        </w:tc>
+        <w:tc>
+          <w:tcPr/>
+          <w:p>
+            <w:pPr>
+              <w:pStyle w:val="Compact"/>
+              <w:jc w:val="left"/>
+            </w:pPr>
+            <w:r>
+              <w:t xml:space="preserve">servizio (terapia)</w:t>
+            </w:r>
+          </w:p>
+        </w:tc>
+      </w:tr>
+      <w:tr>
+        <w:tc>
+          <w:tcPr/>
+          <w:p>
+            <w:pPr>
+              <w:pStyle w:val="Compact"/>
+              <w:jc w:val="left"/>
+            </w:pPr>
+            <w:r>
+              <w:t xml:space="preserve">Riabilitazione mielolesioni</w:t>
+            </w:r>
+          </w:p>
+        </w:tc>
+        <w:tc>
+          <w:tcPr/>
+          <w:p>
+            <w:pPr>
+              <w:pStyle w:val="Compact"/>
+              <w:jc w:val="left"/>
+            </w:pPr>
+            <w:r>
+              <w:t xml:space="preserve">Physiotherapy, Neurologic</w:t>
+            </w:r>
+          </w:p>
+        </w:tc>
+        <w:tc>
+          <w:tcPr/>
+          <w:p>
+            <w:pPr>
+              <w:pStyle w:val="Compact"/>
+              <w:jc w:val="left"/>
+            </w:pPr>
+            <w:r>
+              <w:t xml:space="preserve">servizio (terapia)</w:t>
+            </w:r>
+          </w:p>
+        </w:tc>
+      </w:tr>
+      <w:tr>
+        <w:tc>
+          <w:tcPr/>
+          <w:p>
+            <w:pPr>
+              <w:pStyle w:val="Compact"/>
+              <w:jc w:val="left"/>
+            </w:pPr>
+            <w:r>
+              <w:t xml:space="preserve">Riabilitazione neurologica</w:t>
+            </w:r>
+          </w:p>
+        </w:tc>
+        <w:tc>
+          <w:tcPr/>
+          <w:p>
+            <w:pPr>
+              <w:pStyle w:val="Compact"/>
+              <w:jc w:val="left"/>
+            </w:pPr>
+            <w:r>
+              <w:t xml:space="preserve">Physiotherapy, Neurologic</w:t>
+            </w:r>
+          </w:p>
+        </w:tc>
+        <w:tc>
+          <w:tcPr/>
+          <w:p>
+            <w:pPr>
+              <w:pStyle w:val="Compact"/>
+              <w:jc w:val="left"/>
+            </w:pPr>
+            <w:r>
+              <w:t xml:space="preserve">servizio (terapia)</w:t>
+            </w:r>
+          </w:p>
+        </w:tc>
+      </w:tr>
+      <w:tr>
+        <w:tc>
+          <w:tcPr/>
+          <w:p>
+            <w:pPr>
+              <w:pStyle w:val="Compact"/>
+              <w:jc w:val="left"/>
+            </w:pPr>
+            <w:r>
+              <w:t xml:space="preserve">Riabilitazione ortopedica</w:t>
+            </w:r>
+          </w:p>
+        </w:tc>
+        <w:tc>
+          <w:tcPr/>
+          <w:p>
+            <w:pPr>
+              <w:pStyle w:val="Compact"/>
+              <w:jc w:val="left"/>
+            </w:pPr>
+            <w:r>
+              <w:t xml:space="preserve">Physiotherapy, Musculoskeletal</w:t>
+            </w:r>
+          </w:p>
+        </w:tc>
+        <w:tc>
+          <w:tcPr/>
+          <w:p>
+            <w:pPr>
+              <w:pStyle w:val="Compact"/>
+              <w:jc w:val="left"/>
+            </w:pPr>
+            <w:r>
+              <w:t xml:space="preserve">servizio (terapia)</w:t>
+            </w:r>
+          </w:p>
+        </w:tc>
+      </w:tr>
+      <w:tr>
+        <w:tc>
+          <w:tcPr/>
+          <w:p>
+            <w:pPr>
+              <w:pStyle w:val="Compact"/>
+              <w:jc w:val="left"/>
+            </w:pPr>
+            <w:r>
+              <w:t xml:space="preserve">Riabilitazione pneumologica</w:t>
+            </w:r>
+          </w:p>
+        </w:tc>
+        <w:tc>
+          <w:tcPr/>
+          <w:p>
+            <w:pPr>
+              <w:pStyle w:val="Compact"/>
+              <w:jc w:val="left"/>
+            </w:pPr>
+            <w:r>
+              <w:t xml:space="preserve">Physiotherapy, Pulmonary</w:t>
+            </w:r>
+          </w:p>
+        </w:tc>
+        <w:tc>
+          <w:tcPr/>
+          <w:p>
+            <w:pPr>
+              <w:pStyle w:val="Compact"/>
+              <w:jc w:val="left"/>
+            </w:pPr>
+            <w:r>
+              <w:t xml:space="preserve">servizio (terapia)</w:t>
+            </w:r>
+          </w:p>
+        </w:tc>
+      </w:tr>
+      <w:tr>
+        <w:tc>
+          <w:tcPr/>
+          <w:p>
+            <w:pPr>
+              <w:pStyle w:val="Compact"/>
+              <w:jc w:val="left"/>
+            </w:pPr>
+            <w:r>
+              <w:t xml:space="preserve">Riabilitazione urologica e del pavimento pelvico</w:t>
+            </w:r>
+          </w:p>
+        </w:tc>
+        <w:tc>
+          <w:tcPr/>
+          <w:p>
+            <w:pPr>
+              <w:pStyle w:val="Compact"/>
+              <w:jc w:val="left"/>
+            </w:pPr>
+            <w:r>
+              <w:t xml:space="preserve">Physiotherapy, Urologic</w:t>
+            </w:r>
+          </w:p>
+        </w:tc>
+        <w:tc>
+          <w:tcPr/>
+          <w:p>
+            <w:pPr>
+              <w:pStyle w:val="Compact"/>
+              <w:jc w:val="left"/>
+            </w:pPr>
+            <w:r>
+              <w:t xml:space="preserve">servizio (terapia)</w:t>
+            </w:r>
+          </w:p>
+        </w:tc>
+      </w:tr>
+      <w:tr>
+        <w:tc>
+          <w:tcPr/>
+          <w:p>
+            <w:pPr>
+              <w:pStyle w:val="Compact"/>
+              <w:jc w:val="left"/>
+            </w:pPr>
+            <w:r>
+              <w:t xml:space="preserve">Risonanza magnetica</w:t>
+            </w:r>
+          </w:p>
+        </w:tc>
+        <w:tc>
+          <w:tcPr/>
+          <w:p>
+            <w:pPr>
+              <w:pStyle w:val="Compact"/>
+              <w:jc w:val="left"/>
+            </w:pPr>
+            <w:r>
+              <w:t xml:space="preserve">Radiography</w:t>
+            </w:r>
+          </w:p>
+        </w:tc>
+        <w:tc>
+          <w:tcPr/>
+          <w:p>
+            <w:pPr>
+              <w:pStyle w:val="Compact"/>
+              <w:jc w:val="left"/>
+            </w:pPr>
+            <w:r>
+              <w:t xml:space="preserve">servizio (esame)</w:t>
+            </w:r>
+          </w:p>
+        </w:tc>
+      </w:tr>
+      <w:tr>
+        <w:tc>
+          <w:tcPr/>
+          <w:p>
+            <w:pPr>
+              <w:pStyle w:val="Compact"/>
+              <w:jc w:val="left"/>
+            </w:pPr>
+            <w:r>
+              <w:t xml:space="preserve">Schizofrenia</w:t>
+            </w:r>
+          </w:p>
+        </w:tc>
+        <w:tc>
+          <w:tcPr/>
+          <w:p>
+            <w:pPr>
+              <w:pStyle w:val="Compact"/>
+              <w:jc w:val="left"/>
+            </w:pPr>
+            <w:r>
+              <w:t xml:space="preserve">Psychiatric</w:t>
+            </w:r>
+          </w:p>
+        </w:tc>
+        <w:tc>
+          <w:tcPr/>
+          <w:p>
+            <w:pPr>
+              <w:pStyle w:val="Compact"/>
+              <w:jc w:val="left"/>
+            </w:pPr>
+            <w:r>
+              <w:t xml:space="preserve">condizione trattata</w:t>
+            </w:r>
+          </w:p>
+        </w:tc>
+      </w:tr>
+      <w:tr>
+        <w:tc>
+          <w:tcPr/>
+          <w:p>
+            <w:pPr>
+              <w:pStyle w:val="Compact"/>
+              <w:jc w:val="left"/>
+            </w:pPr>
+            <w:r>
+              <w:t xml:space="preserve">Senologia - Mammografia</w:t>
+            </w:r>
+          </w:p>
+        </w:tc>
+        <w:tc>
+          <w:tcPr/>
+          <w:p>
+            <w:pPr>
+              <w:pStyle w:val="Compact"/>
+              <w:jc w:val="left"/>
+            </w:pPr>
+            <w:r>
+              <w:t xml:space="preserve">Radiography</w:t>
+            </w:r>
+          </w:p>
+        </w:tc>
+        <w:tc>
+          <w:tcPr/>
+          <w:p>
+            <w:pPr>
+              <w:pStyle w:val="Compact"/>
+              <w:jc w:val="left"/>
+            </w:pPr>
+            <w:r>
+              <w:t xml:space="preserve">servizio (esame)</w:t>
+            </w:r>
+          </w:p>
+        </w:tc>
+      </w:tr>
+      <w:tr>
+        <w:tc>
+          <w:tcPr/>
+          <w:p>
+            <w:pPr>
+              <w:pStyle w:val="Compact"/>
+              <w:jc w:val="left"/>
+            </w:pPr>
+            <w:r>
+              <w:t xml:space="preserve">Servizio anestesia</w:t>
+            </w:r>
+          </w:p>
+        </w:tc>
+        <w:tc>
+          <w:tcPr/>
+          <w:p>
+            <w:pPr>
+              <w:pStyle w:val="Compact"/>
+              <w:jc w:val="left"/>
+            </w:pPr>
+            <w:r>
+              <w:t xml:space="preserve">Anesthesia</w:t>
+            </w:r>
+          </w:p>
+        </w:tc>
+        <w:tc>
+          <w:tcPr/>
+          <w:p>
+            <w:pPr>
+              <w:pStyle w:val="Compact"/>
+              <w:jc w:val="left"/>
+            </w:pPr>
+            <w:r>
+              <w:t xml:space="preserve">solo specialità</w:t>
+            </w:r>
+          </w:p>
+        </w:tc>
+      </w:tr>
+      <w:tr>
+        <w:tc>
+          <w:tcPr/>
+          <w:p>
+            <w:pPr>
+              <w:pStyle w:val="Compact"/>
+              <w:jc w:val="left"/>
+            </w:pPr>
+            <w:r>
+              <w:t xml:space="preserve">TAC</w:t>
+            </w:r>
+          </w:p>
+        </w:tc>
+        <w:tc>
+          <w:tcPr/>
+          <w:p>
+            <w:pPr>
+              <w:pStyle w:val="Compact"/>
+              <w:jc w:val="left"/>
+            </w:pPr>
+            <w:r>
+              <w:t xml:space="preserve">Radiography</w:t>
+            </w:r>
+          </w:p>
+        </w:tc>
+        <w:tc>
+          <w:tcPr/>
+          <w:p>
+            <w:pPr>
+              <w:pStyle w:val="Compact"/>
+              <w:jc w:val="left"/>
+            </w:pPr>
+            <w:r>
+              <w:t xml:space="preserve">servizio (esame)</w:t>
+            </w:r>
+          </w:p>
+        </w:tc>
+      </w:tr>
+      <w:tr>
+        <w:tc>
+          <w:tcPr/>
+          <w:p>
+            <w:pPr>
+              <w:pStyle w:val="Compact"/>
+              <w:jc w:val="left"/>
+            </w:pPr>
+            <w:r>
+              <w:t xml:space="preserve">TC Cone Beam</w:t>
+            </w:r>
+          </w:p>
+        </w:tc>
+        <w:tc>
+          <w:tcPr/>
+          <w:p>
+            <w:pPr>
+              <w:pStyle w:val="Compact"/>
+              <w:jc w:val="left"/>
+            </w:pPr>
+            <w:r>
+              <w:t xml:space="preserve">Radiography, Dentistry</w:t>
+            </w:r>
+          </w:p>
+        </w:tc>
+        <w:tc>
+          <w:tcPr/>
+          <w:p>
+            <w:pPr>
+              <w:pStyle w:val="Compact"/>
+              <w:jc w:val="left"/>
+            </w:pPr>
+            <w:r>
+              <w:t xml:space="preserve">servizio (esame)</w:t>
+            </w:r>
+          </w:p>
+        </w:tc>
+      </w:tr>
+      <w:tr>
+        <w:tc>
+          <w:tcPr/>
+          <w:p>
+            <w:pPr>
+              <w:pStyle w:val="Compact"/>
+              <w:jc w:val="left"/>
+            </w:pPr>
+            <w:r>
+              <w:t xml:space="preserve">Urologia-Andrologia</w:t>
+            </w:r>
+          </w:p>
+        </w:tc>
+        <w:tc>
+          <w:tcPr/>
+          <w:p>
+            <w:pPr>
+              <w:pStyle w:val="Compact"/>
+              <w:jc w:val="left"/>
+            </w:pPr>
+            <w:r>
+              <w:t xml:space="preserve">Urologic</w:t>
+            </w:r>
+          </w:p>
+        </w:tc>
+        <w:tc>
+          <w:tcPr/>
+          <w:p>
+            <w:pPr>
+              <w:pStyle w:val="Compact"/>
+              <w:jc w:val="left"/>
+            </w:pPr>
+            <w:r>
+              <w:t xml:space="preserve">solo specialità</w:t>
+            </w:r>
+          </w:p>
+        </w:tc>
+      </w:tr>
+    </w:tbl>
     <w:bookmarkEnd w:id="27"/>
+    <w:bookmarkEnd w:id="28"/>
     <w:sectPr/>
   </w:body>
 </w:document>

</xml_diff>

<commit_message>
KOS voce 24: confronto sito-Yext delle associazioni struttura-servizi per la validazione di KOS
Co-Authored-By: Claude Opus 5.5 <noreply@anthropic.com>
Claude-Session: https://claude.ai/code/session_01Rr1X44gsg7BUwMzrRvYrc2
</commit_message>
<xml_diff>
--- a/docs/docx/kos-24.docx
+++ b/docs/docx/kos-24.docx
@@ -2,7 +2,7 @@
 <file path=word/document.xml><?xml version="1.0" encoding="utf-8"?>
 <w:document xmlns:w="http://schemas.openxmlformats.org/wordprocessingml/2006/main" xmlns:m="http://schemas.openxmlformats.org/officeDocument/2006/math" xmlns:r="http://schemas.openxmlformats.org/officeDocument/2006/relationships" xmlns:o="urn:schemas-microsoft-com:office:office" xmlns:v="urn:schemas-microsoft-com:vml" xmlns:w10="urn:schemas-microsoft-com:office:word" xmlns:a="http://schemas.openxmlformats.org/drawingml/2006/main" xmlns:pic="http://schemas.openxmlformats.org/drawingml/2006/picture" xmlns:wp="http://schemas.openxmlformats.org/drawingml/2006/wordprocessingDrawing">
   <w:body>
-    <w:bookmarkStart w:id="28" w:name="X13e9b4acbf3cd705c9b15ec2eaf204881b0b6a6"/>
+    <w:bookmarkStart w:id="29" w:name="X13e9b4acbf3cd705c9b15ec2eaf204881b0b6a6"/>
     <w:p>
       <w:pPr>
         <w:pStyle w:val="Heading1"/>
@@ -4800,7 +4800,170 @@
       </w:tr>
     </w:tbl>
     <w:bookmarkEnd w:id="27"/>
+    <w:bookmarkStart w:id="28" w:name="X325e73db51d654a65de349c3c91a896e1f0172c"/>
+    <w:p>
+      <w:pPr>
+        <w:pStyle w:val="Heading2"/>
+      </w:pPr>
+      <w:r>
+        <w:t xml:space="preserve">Confronto sito ↔ Yext delle associazioni struttura-servizi (25/10, per la validazione di KOS)</w:t>
+      </w:r>
+    </w:p>
+    <w:p>
+      <w:pPr>
+        <w:pStyle w:val="FirstParagraph"/>
+      </w:pPr>
+      <w:r>
+        <w:t xml:space="preserve">Le associazioni tra strutture e pagine di «Servizi e cure» sono state riviste a inizio 2025 con il rifacimento del sito</w:t>
+      </w:r>
+      <w:r>
+        <w:t xml:space="preserve"> </w:t>
+      </w:r>
+      <w:r>
+        <w:t xml:space="preserve">e stanno in due punti gestiti a mano: le TV</w:t>
+      </w:r>
+      <w:r>
+        <w:t xml:space="preserve"> </w:t>
+      </w:r>
+      <w:r>
+        <w:rPr>
+          <w:rStyle w:val="VerbatimChar"/>
+        </w:rPr>
+        <w:t xml:space="preserve">map*</w:t>
+      </w:r>
+      <w:r>
+        <w:t xml:space="preserve"> </w:t>
+      </w:r>
+      <w:r>
+        <w:t xml:space="preserve">della scheda e</w:t>
+      </w:r>
+      <w:r>
+        <w:t xml:space="preserve"> </w:t>
+      </w:r>
+      <w:r>
+        <w:rPr>
+          <w:rStyle w:val="VerbatimChar"/>
+        </w:rPr>
+        <w:t xml:space="preserve">mapServiziStrutture</w:t>
+      </w:r>
+      <w:r>
+        <w:t xml:space="preserve"> </w:t>
+      </w:r>
+      <w:r>
+        <w:t xml:space="preserve">della pagina del servizio.</w:t>
+      </w:r>
+      <w:r>
+        <w:t xml:space="preserve"> </w:t>
+      </w:r>
+      <w:r>
+        <w:t xml:space="preserve">Estratte dalla produzione con</w:t>
+      </w:r>
+      <w:r>
+        <w:t xml:space="preserve"> </w:t>
+      </w:r>
+      <w:r>
+        <w:rPr>
+          <w:rStyle w:val="VerbatimChar"/>
+        </w:rPr>
+        <w:t xml:space="preserve">scripts/checks/kos-mappatura-servizi.php</w:t>
+      </w:r>
+      <w:r>
+        <w:t xml:space="preserve"> </w:t>
+      </w:r>
+      <w:r>
+        <w:t xml:space="preserve">e confrontate con i filtri «Servizi e Cure» di</w:t>
+      </w:r>
+      <w:r>
+        <w:t xml:space="preserve"> </w:t>
+      </w:r>
+      <w:r>
+        <w:t xml:space="preserve">Yext con</w:t>
+      </w:r>
+      <w:r>
+        <w:t xml:space="preserve"> </w:t>
+      </w:r>
+      <w:r>
+        <w:rPr>
+          <w:rStyle w:val="VerbatimChar"/>
+        </w:rPr>
+        <w:t xml:space="preserve">scripts/yext/confronto-servizi.py</w:t>
+      </w:r>
+      <w:r>
+        <w:t xml:space="preserve">:</w:t>
+      </w:r>
+      <w:r>
+        <w:t xml:space="preserve"> </w:t>
+      </w:r>
+      <w:r>
+        <w:rPr>
+          <w:rStyle w:val="VerbatimChar"/>
+        </w:rPr>
+        <w:t xml:space="preserve">kosgroup/dati/voce-24/confronto-servizi-2026-10-25.xlsx</w:t>
+      </w:r>
+      <w:r>
+        <w:t xml:space="preserve">, una riga per</w:t>
+      </w:r>
+      <w:r>
+        <w:t xml:space="preserve"> </w:t>
+      </w:r>
+      <w:r>
+        <w:t xml:space="preserve">struttura e servizio, con «Esito KOS» da compilare.</w:t>
+      </w:r>
+    </w:p>
+    <w:p>
+      <w:pPr>
+        <w:pStyle w:val="BodyText"/>
+      </w:pPr>
+      <w:r>
+        <w:t xml:space="preserve">733 associazioni su 61 strutture: 256 coerenti nelle tre fonti, 232 trattamenti (sul sito, che Yext non ha tra i</w:t>
+      </w:r>
+      <w:r>
+        <w:t xml:space="preserve"> </w:t>
+      </w:r>
+      <w:r>
+        <w:t xml:space="preserve">filtri), 31 solo sul sito, 37 in Yext ma sul sito in una sola direzione, 172 sul sito in una sola direzione e assenti in</w:t>
+      </w:r>
+      <w:r>
+        <w:t xml:space="preserve"> </w:t>
+      </w:r>
+      <w:r>
+        <w:t xml:space="preserve">Yext, 5 solo in Yext (Poliambulatorio Valdaso, Villa Fastiggi).</w:t>
+      </w:r>
+    </w:p>
+    <w:p>
+      <w:pPr>
+        <w:pStyle w:val="BodyText"/>
+      </w:pPr>
+      <w:r>
+        <w:t xml:space="preserve">Proposta: le associazioni confermate da KOS diventano la fonte unica, tenuta sulla scheda struttura (la pagina del</w:t>
+      </w:r>
+      <w:r>
+        <w:t xml:space="preserve"> </w:t>
+      </w:r>
+      <w:r>
+        <w:t xml:space="preserve">servizio la legge al contrario); i servizi del dato strutturato puntano alle pagine del sito (</w:t>
+      </w:r>
+      <w:r>
+        <w:rPr>
+          <w:rStyle w:val="VerbatimChar"/>
+        </w:rPr>
+        <w:t xml:space="preserve">url</w:t>
+      </w:r>
+      <w:r>
+        <w:t xml:space="preserve"> </w:t>
+      </w:r>
+      <w:r>
+        <w:t xml:space="preserve">del servizio) e Yext,</w:t>
+      </w:r>
+      <w:r>
+        <w:t xml:space="preserve"> </w:t>
+      </w:r>
+      <w:r>
+        <w:t xml:space="preserve">poi RetailTune, si allineano al sito. Fino alla validazione, l'import da Yext dei servizi resta in sospeso sullo stage.</w:t>
+      </w:r>
+    </w:p>
     <w:bookmarkEnd w:id="28"/>
+    <w:bookmarkEnd w:id="29"/>
     <w:sectPr/>
   </w:body>
 </w:document>

</xml_diff>

<commit_message>
KOS voce 24: scheda struttura come fonte delle associazioni; confronto con stati «Sulla scheda» e «Da verificare»
Co-Authored-By: Claude Opus 5.5 <noreply@anthropic.com>
Claude-Session: https://claude.ai/code/session_01Rr1X44gsg7BUwMzrRvYrc2
</commit_message>
<xml_diff>
--- a/docs/docx/kos-24.docx
+++ b/docs/docx/kos-24.docx
@@ -4960,6 +4960,63 @@
       </w:r>
       <w:r>
         <w:t xml:space="preserve">poi RetailTune, si allineano al sito. Fino alla validazione, l'import da Yext dei servizi resta in sospeso sullo stage.</w:t>
+      </w:r>
+    </w:p>
+    <w:p>
+      <w:pPr>
+        <w:pStyle w:val="BodyText"/>
+      </w:pPr>
+      <w:r>
+        <w:rPr>
+          <w:bCs/>
+          <w:b/>
+        </w:rPr>
+        <w:t xml:space="preserve">Aggiornamento 25/10 sera.</w:t>
+      </w:r>
+      <w:r>
+        <w:t xml:space="preserve"> </w:t>
+      </w:r>
+      <w:r>
+        <w:t xml:space="preserve">Le associazioni presenti solo sulla pagina del servizio risultano in gran parte copiate</w:t>
+      </w:r>
+      <w:r>
+        <w:t xml:space="preserve"> </w:t>
+      </w:r>
+      <w:r>
+        <w:t xml:space="preserve">dai filtri Yext (tutte le 37 «servizio + Yext» senza la scheda; es. Dermatologia su Centro Cardinal Ferrari, che non la</w:t>
+      </w:r>
+      <w:r>
+        <w:t xml:space="preserve"> </w:t>
+      </w:r>
+      <w:r>
+        <w:t xml:space="preserve">offre). Decisione: la fonte è la scheda struttura, curata nel rifacimento del 2025. Le 102 associazioni solo sulla</w:t>
+      </w:r>
+      <w:r>
+        <w:t xml:space="preserve"> </w:t>
+      </w:r>
+      <w:r>
+        <w:t xml:space="preserve">scheda si completano sulla pagina del servizio (</w:t>
+      </w:r>
+      <w:r>
+        <w:rPr>
+          <w:rStyle w:val="VerbatimChar"/>
+        </w:rPr>
+        <w:t xml:space="preserve">kos-mappatura-inversa.php --solo-servizi</w:t>
+      </w:r>
+      <w:r>
+        <w:t xml:space="preserve">); le 107 solo sulla pagina</w:t>
+      </w:r>
+      <w:r>
+        <w:t xml:space="preserve"> </w:t>
+      </w:r>
+      <w:r>
+        <w:t xml:space="preserve">del servizio diventano domande per KOS (stato «Da verificare» nell'Excel). La mappatura inversa completa scritta sullo</w:t>
+      </w:r>
+      <w:r>
+        <w:t xml:space="preserve"> </w:t>
+      </w:r>
+      <w:r>
+        <w:t xml:space="preserve">stage nel pomeriggio va annullata con il suo file di ripristino.</w:t>
       </w:r>
     </w:p>
     <w:bookmarkEnd w:id="28"/>

</xml_diff>

<commit_message>
KOS voce 24: esito dei validatori con i servizi dal sito
Co-Authored-By: Claude Opus 5.5 <noreply@anthropic.com>
Claude-Session: https://claude.ai/code/session_01Rr1X44gsg7BUwMzrRvYrc2
</commit_message>
<xml_diff>
--- a/docs/docx/kos-24.docx
+++ b/docs/docx/kos-24.docx
@@ -5172,6 +5172,41 @@
       </w:r>
       <w:r>
         <w:t xml:space="preserve">confermate da KOS aggiornano il dato strutturato da sole.</w:t>
+      </w:r>
+    </w:p>
+    <w:p>
+      <w:pPr>
+        <w:pStyle w:val="BodyText"/>
+      </w:pPr>
+      <w:r>
+        <w:t xml:space="preserve">Validatori sui servizi dal sito (25/10, stage): Centro Cardinal Ferrari (16 terapie con URL) e Villa dei Pini</w:t>
+      </w:r>
+      <w:r>
+        <w:t xml:space="preserve"> </w:t>
+      </w:r>
+      <w:r>
+        <w:t xml:space="preserve">Civitanova (Hospital, 21 prestazioni ed esami con URL, 13 specialità, prenotazione) con 0 errori e 0 avvisi su</w:t>
+      </w:r>
+      <w:r>
+        <w:t xml:space="preserve"> </w:t>
+      </w:r>
+      <w:r>
+        <w:t xml:space="preserve">schema.org; «Attività locali» valida nel Rich Results Test, con il solo campo facoltativo</w:t>
+      </w:r>
+      <w:r>
+        <w:t xml:space="preserve"> </w:t>
+      </w:r>
+      <w:r>
+        <w:rPr>
+          <w:rStyle w:val="VerbatimChar"/>
+        </w:rPr>
+        <w:t xml:space="preserve">priceRange</w:t>
+      </w:r>
+      <w:r>
+        <w:t xml:space="preserve"> </w:t>
+      </w:r>
+      <w:r>
+        <w:t xml:space="preserve">mancante.</w:t>
       </w:r>
     </w:p>
     <w:bookmarkEnd w:id="28"/>

</xml_diff>

<commit_message>
KOS voce 24: esito dei validatori su Casa Cima
Co-Authored-By: Claude Opus 5.5 <noreply@anthropic.com>
Claude-Session: https://claude.ai/code/session_01Rr1X44gsg7BUwMzrRvYrc2
</commit_message>
<xml_diff>
--- a/docs/docx/kos-24.docx
+++ b/docs/docx/kos-24.docx
@@ -5185,7 +5185,31 @@
         <w:t xml:space="preserve"> </w:t>
       </w:r>
       <w:r>
-        <w:t xml:space="preserve">Civitanova (Hospital, 21 prestazioni ed esami con URL, 13 specialità, prenotazione) con 0 errori e 0 avvisi su</w:t>
+        <w:t xml:space="preserve">Civitanova (Hospital, 21 prestazioni ed esami con URL, 13 specialità, prenotazione) e Casa Cima (3 terapie in</w:t>
+      </w:r>
+      <w:r>
+        <w:t xml:space="preserve"> </w:t>
+      </w:r>
+      <w:r>
+        <w:rPr>
+          <w:rStyle w:val="VerbatimChar"/>
+        </w:rPr>
+        <w:t xml:space="preserve">availableService</w:t>
+      </w:r>
+      <w:r>
+        <w:t xml:space="preserve">, 3 condizioni trattate in</w:t>
+      </w:r>
+      <w:r>
+        <w:t xml:space="preserve"> </w:t>
+      </w:r>
+      <w:r>
+        <w:rPr>
+          <w:rStyle w:val="VerbatimChar"/>
+        </w:rPr>
+        <w:t xml:space="preserve">knowsAbout</w:t>
+      </w:r>
+      <w:r>
+        <w:t xml:space="preserve">, con URL) con 0 errori e 0 avvisi su</w:t>
       </w:r>
       <w:r>
         <w:t xml:space="preserve"> </w:t>

</xml_diff>

<commit_message>
KOS voce 24: prenotazione dal portale TuoTempo della sede e catalogo delle prestazioni prenotabili per branca, con kos_referrer
Co-Authored-By: Claude Opus 5.5 <noreply@anthropic.com>
Claude-Session: https://claude.ai/code/session_01Rr1X44gsg7BUwMzrRvYrc2
</commit_message>
<xml_diff>
--- a/docs/docx/kos-24.docx
+++ b/docs/docx/kos-24.docx
@@ -2,7 +2,7 @@
 <file path=word/document.xml><?xml version="1.0" encoding="utf-8"?>
 <w:document xmlns:w="http://schemas.openxmlformats.org/wordprocessingml/2006/main" xmlns:m="http://schemas.openxmlformats.org/officeDocument/2006/math" xmlns:r="http://schemas.openxmlformats.org/officeDocument/2006/relationships" xmlns:o="urn:schemas-microsoft-com:office:office" xmlns:v="urn:schemas-microsoft-com:vml" xmlns:w10="urn:schemas-microsoft-com:office:word" xmlns:a="http://schemas.openxmlformats.org/drawingml/2006/main" xmlns:pic="http://schemas.openxmlformats.org/drawingml/2006/picture" xmlns:wp="http://schemas.openxmlformats.org/drawingml/2006/wordprocessingDrawing">
   <w:body>
-    <w:bookmarkStart w:id="30" w:name="X13e9b4acbf3cd705c9b15ec2eaf204881b0b6a6"/>
+    <w:bookmarkStart w:id="31" w:name="X13e9b4acbf3cd705c9b15ec2eaf204881b0b6a6"/>
     <w:p>
       <w:pPr>
         <w:pStyle w:val="Heading1"/>
@@ -4800,7 +4800,7 @@
       </w:tr>
     </w:tbl>
     <w:bookmarkEnd w:id="27"/>
-    <w:bookmarkStart w:id="29" w:name="X325e73db51d654a65de349c3c91a896e1f0172c"/>
+    <w:bookmarkStart w:id="30" w:name="X325e73db51d654a65de349c3c91a896e1f0172c"/>
     <w:p>
       <w:pPr>
         <w:pStyle w:val="Heading2"/>
@@ -5234,8 +5234,254 @@
       </w:r>
     </w:p>
     <w:bookmarkEnd w:id="28"/>
+    <w:bookmarkStart w:id="29" w:name="Xb44a0731af8229f620732d670497310882cd123"/>
+    <w:p>
+      <w:pPr>
+        <w:pStyle w:val="Heading3"/>
+      </w:pPr>
+      <w:r>
+        <w:t xml:space="preserve">Prenotazione online da TuoTempo (25/10 sera)</w:t>
+      </w:r>
+    </w:p>
+    <w:p>
+      <w:pPr>
+        <w:pStyle w:val="FirstParagraph"/>
+      </w:pPr>
+      <w:r>
+        <w:t xml:space="preserve">Dove la scheda ha la TV</w:t>
+      </w:r>
+      <w:r>
+        <w:t xml:space="preserve"> </w:t>
+      </w:r>
+      <w:r>
+        <w:rPr>
+          <w:rStyle w:val="VerbatimChar"/>
+        </w:rPr>
+        <w:t xml:space="preserve">istanza</w:t>
+      </w:r>
+      <w:r>
+        <w:t xml:space="preserve"> </w:t>
+      </w:r>
+      <w:r>
+        <w:t xml:space="preserve">compilata (areaid TuoTempo della sede: è la stessa che accende la barra di</w:t>
+      </w:r>
+      <w:r>
+        <w:t xml:space="preserve"> </w:t>
+      </w:r>
+      <w:r>
+        <w:t xml:space="preserve">prenotazione), il nodo struttura ha:</w:t>
+      </w:r>
+    </w:p>
+    <w:p>
+      <w:pPr>
+        <w:numPr>
+          <w:ilvl w:val="0"/>
+          <w:numId w:val="1005"/>
+        </w:numPr>
+        <w:pStyle w:val="Compact"/>
+      </w:pPr>
+      <w:r>
+        <w:t xml:space="preserve">l'azione «Prenota online» verso il portale TuoTempo filtrato sulla sede (al posto della pagina generica</w:t>
+      </w:r>
+      <w:r>
+        <w:t xml:space="preserve"> </w:t>
+      </w:r>
+      <w:r>
+        <w:rPr>
+          <w:rStyle w:val="VerbatimChar"/>
+        </w:rPr>
+        <w:t xml:space="preserve">/it/prenota-online</w:t>
+      </w:r>
+      <w:r>
+        <w:t xml:space="preserve"> </w:t>
+      </w:r>
+      <w:r>
+        <w:t xml:space="preserve">che arriva da Yext; senza</w:t>
+      </w:r>
+      <w:r>
+        <w:t xml:space="preserve"> </w:t>
+      </w:r>
+      <w:r>
+        <w:rPr>
+          <w:rStyle w:val="VerbatimChar"/>
+        </w:rPr>
+        <w:t xml:space="preserve">istanza</w:t>
+      </w:r>
+      <w:r>
+        <w:t xml:space="preserve"> </w:t>
+      </w:r>
+      <w:r>
+        <w:t xml:space="preserve">resta il link di Yext);</w:t>
+      </w:r>
+    </w:p>
+    <w:p>
+      <w:pPr>
+        <w:numPr>
+          <w:ilvl w:val="0"/>
+          <w:numId w:val="1005"/>
+        </w:numPr>
+        <w:pStyle w:val="Compact"/>
+      </w:pPr>
+      <w:r>
+        <w:rPr>
+          <w:rStyle w:val="VerbatimChar"/>
+        </w:rPr>
+        <w:t xml:space="preserve">hasOfferCatalog</w:t>
+      </w:r>
+      <w:r>
+        <w:t xml:space="preserve"> </w:t>
+      </w:r>
+      <w:r>
+        <w:t xml:space="preserve">«Prestazioni prenotabili online», diviso per branca (sotto-cataloghi senza link: il portale non si</w:t>
+      </w:r>
+      <w:r>
+        <w:t xml:space="preserve"> </w:t>
+      </w:r>
+      <w:r>
+        <w:t xml:space="preserve">apre sulla sola branca), con una</w:t>
+      </w:r>
+      <w:r>
+        <w:t xml:space="preserve"> </w:t>
+      </w:r>
+      <w:r>
+        <w:rPr>
+          <w:rStyle w:val="VerbatimChar"/>
+        </w:rPr>
+        <w:t xml:space="preserve">Offer</w:t>
+      </w:r>
+      <w:r>
+        <w:t xml:space="preserve"> </w:t>
+      </w:r>
+      <w:r>
+        <w:t xml:space="preserve">per prestazione e il link diretto sede + prestazione. Stesse regole della</w:t>
+      </w:r>
+      <w:r>
+        <w:t xml:space="preserve"> </w:t>
+      </w:r>
+      <w:r>
+        <w:t xml:space="preserve">barra: sede non nascosta, prestazione non nascosta o prenotabile in differita, almeno un medico (tabelle</w:t>
+      </w:r>
+      <w:r>
+        <w:t xml:space="preserve"> </w:t>
+      </w:r>
+      <w:r>
+        <w:rPr>
+          <w:rStyle w:val="VerbatimChar"/>
+        </w:rPr>
+        <w:t xml:space="preserve">kos_strutture</w:t>
+      </w:r>
+      <w:r>
+        <w:t xml:space="preserve">,</w:t>
+      </w:r>
+      <w:r>
+        <w:t xml:space="preserve"> </w:t>
+      </w:r>
+      <w:r>
+        <w:rPr>
+          <w:rStyle w:val="VerbatimChar"/>
+        </w:rPr>
+        <w:t xml:space="preserve">kos_prestazioni</w:t>
+      </w:r>
+      <w:r>
+        <w:t xml:space="preserve">,</w:t>
+      </w:r>
+      <w:r>
+        <w:t xml:space="preserve"> </w:t>
+      </w:r>
+      <w:r>
+        <w:rPr>
+          <w:rStyle w:val="VerbatimChar"/>
+        </w:rPr>
+        <w:t xml:space="preserve">kos_medici_prestazioni</w:t>
+      </w:r>
+      <w:r>
+        <w:t xml:space="preserve">). Caso più lungo indicato da Danilo: Risonanza</w:t>
+      </w:r>
+      <w:r>
+        <w:t xml:space="preserve"> </w:t>
+      </w:r>
+      <w:r>
+        <w:t xml:space="preserve">magnetica con 54 prestazioni.</w:t>
+      </w:r>
+      <w:r>
+        <w:t xml:space="preserve"> </w:t>
+      </w:r>
+      <w:r>
+        <w:t xml:space="preserve">Tutti i link portano</w:t>
+      </w:r>
+      <w:r>
+        <w:t xml:space="preserve"> </w:t>
+      </w:r>
+      <w:r>
+        <w:rPr>
+          <w:rStyle w:val="VerbatimChar"/>
+        </w:rPr>
+        <w:t xml:space="preserve">kos_referrer=dato-strutturato</w:t>
+      </w:r>
+      <w:r>
+        <w:t xml:space="preserve">, per distinguere nel funnel di prenotazione le visite arrivate dal</w:t>
+      </w:r>
+      <w:r>
+        <w:t xml:space="preserve"> </w:t>
+      </w:r>
+      <w:r>
+        <w:t xml:space="preserve">dato strutturato (assistenti AI, motori). Impostazioni</w:t>
+      </w:r>
+      <w:r>
+        <w:t xml:space="preserve"> </w:t>
+      </w:r>
+      <w:r>
+        <w:rPr>
+          <w:rStyle w:val="VerbatimChar"/>
+        </w:rPr>
+        <w:t xml:space="preserve">kos.prenotazione_portale</w:t>
+      </w:r>
+      <w:r>
+        <w:t xml:space="preserve">,</w:t>
+      </w:r>
+      <w:r>
+        <w:t xml:space="preserve"> </w:t>
+      </w:r>
+      <w:r>
+        <w:rPr>
+          <w:rStyle w:val="VerbatimChar"/>
+        </w:rPr>
+        <w:t xml:space="preserve">kos.prenotazione_referrer</w:t>
+      </w:r>
+      <w:r>
+        <w:t xml:space="preserve">,</w:t>
+      </w:r>
+      <w:r>
+        <w:t xml:space="preserve"> </w:t>
+      </w:r>
+      <w:r>
+        <w:rPr>
+          <w:rStyle w:val="VerbatimChar"/>
+        </w:rPr>
+        <w:t xml:space="preserve">kos.prenotazione_tv</w:t>
+      </w:r>
+      <w:r>
+        <w:t xml:space="preserve"> </w:t>
+      </w:r>
+      <w:r>
+        <w:t xml:space="preserve">(default</w:t>
+      </w:r>
+      <w:r>
+        <w:t xml:space="preserve"> </w:t>
+      </w:r>
+      <w:r>
+        <w:rPr>
+          <w:rStyle w:val="VerbatimChar"/>
+        </w:rPr>
+        <w:t xml:space="preserve">istanza</w:t>
+      </w:r>
+      <w:r>
+        <w:t xml:space="preserve">). Il catalogo si aggiorna con la cache della pagina.</w:t>
+      </w:r>
+    </w:p>
     <w:bookmarkEnd w:id="29"/>
     <w:bookmarkEnd w:id="30"/>
+    <w:bookmarkEnd w:id="31"/>
     <w:sectPr/>
   </w:body>
 </w:document>
@@ -5544,6 +5790,9 @@
     <w:lvlOverride w:ilvl="8">
       <w:startOverride w:val="1"/>
     </w:lvlOverride>
+  </w:num>
+  <w:num w:numId="1005">
+    <w:abstractNumId w:val="991"/>
   </w:num>
 </w:numbering>
 </file>

</xml_diff>

<commit_message>
KOS voce 24: catalogo delle prestazioni prenotabili verificato, tenuto completo
Co-Authored-By: Claude Opus 5.5 <noreply@anthropic.com>
Claude-Session: https://claude.ai/code/session_01Rr1X44gsg7BUwMzrRvYrc2
</commit_message>
<xml_diff>
--- a/docs/docx/kos-24.docx
+++ b/docs/docx/kos-24.docx
@@ -5477,6 +5477,26 @@
       </w:r>
       <w:r>
         <w:t xml:space="preserve">). Il catalogo si aggiorna con la cache della pagina.</w:t>
+      </w:r>
+    </w:p>
+    <w:p>
+      <w:pPr>
+        <w:pStyle w:val="FirstParagraph"/>
+      </w:pPr>
+      <w:r>
+        <w:t xml:space="preserve">Validatori (25/10 sera): Villa dei Pini Civitanova con prenotazione attiva, 30 branche e 273 prestazioni prenotabili nel</w:t>
+      </w:r>
+      <w:r>
+        <w:t xml:space="preserve"> </w:t>
+      </w:r>
+      <w:r>
+        <w:t xml:space="preserve">catalogo, 0 errori e 0 avvisi; link sede + prestazione senza medico verificato da Danilo (TuoTempo si apre sulla</w:t>
+      </w:r>
+      <w:r>
+        <w:t xml:space="preserve"> </w:t>
+      </w:r>
+      <w:r>
+        <w:t xml:space="preserve">prestazione). Deciso di tenere il catalogo completo (Villa dei Pini è il caso più ampio, circa 60-70 KB di JSON-LD).</w:t>
       </w:r>
     </w:p>
     <w:bookmarkEnd w:id="29"/>

</xml_diff>

<commit_message>
KOS-24 catalogo prenotazioni: tolta category ripetuta dalle offerte
Co-Authored-By: Claude Opus 5.5 <noreply@anthropic.com>
Claude-Session: https://claude.ai/code/session_01Rr1X44gsg7BUwMzrRvYrc2
</commit_message>
<xml_diff>
--- a/docs/docx/kos-24.docx
+++ b/docs/docx/kos-24.docx
@@ -5496,7 +5496,100 @@
         <w:t xml:space="preserve"> </w:t>
       </w:r>
       <w:r>
-        <w:t xml:space="preserve">prestazione). Deciso di tenere il catalogo completo (Villa dei Pini è il caso più ampio, circa 60-70 KB di JSON-LD).</w:t>
+        <w:t xml:space="preserve">prestazione). Deciso di tenere il catalogo completo.</w:t>
+      </w:r>
+      <w:r>
+        <w:t xml:space="preserve"> </w:t>
+      </w:r>
+      <w:r>
+        <w:t xml:space="preserve">Caso più ampio: Poliambulatorio Santo Stefano (Porto Potenza Picena), 314 prestazioni in 18 branche, 0 errori e 0</w:t>
+      </w:r>
+      <w:r>
+        <w:t xml:space="preserve"> </w:t>
+      </w:r>
+      <w:r>
+        <w:t xml:space="preserve">avvisi. Villa Sant'Alessandro (Roma, MedicalClinic, 8 branche): 0 errori e 0 avvisi. In tutti i casi «Attività locali»</w:t>
+      </w:r>
+      <w:r>
+        <w:t xml:space="preserve"> </w:t>
+      </w:r>
+      <w:r>
+        <w:t xml:space="preserve">valida nel Rich Results Test con il solo</w:t>
+      </w:r>
+      <w:r>
+        <w:t xml:space="preserve"> </w:t>
+      </w:r>
+      <w:r>
+        <w:rPr>
+          <w:rStyle w:val="VerbatimChar"/>
+        </w:rPr>
+        <w:t xml:space="preserve">priceRange</w:t>
+      </w:r>
+      <w:r>
+        <w:t xml:space="preserve"> </w:t>
+      </w:r>
+      <w:r>
+        <w:t xml:space="preserve">facoltativo.</w:t>
+      </w:r>
+      <w:r>
+        <w:t xml:space="preserve"> </w:t>
+      </w:r>
+      <w:r>
+        <w:t xml:space="preserve">Alleggerimento (25/10): tolto</w:t>
+      </w:r>
+      <w:r>
+        <w:t xml:space="preserve"> </w:t>
+      </w:r>
+      <w:r>
+        <w:rPr>
+          <w:rStyle w:val="VerbatimChar"/>
+        </w:rPr>
+        <w:t xml:space="preserve">category</w:t>
+      </w:r>
+      <w:r>
+        <w:t xml:space="preserve"> </w:t>
+      </w:r>
+      <w:r>
+        <w:t xml:space="preserve">dal</w:t>
+      </w:r>
+      <w:r>
+        <w:t xml:space="preserve"> </w:t>
+      </w:r>
+      <w:r>
+        <w:rPr>
+          <w:rStyle w:val="VerbatimChar"/>
+        </w:rPr>
+        <w:t xml:space="preserve">Service</w:t>
+      </w:r>
+      <w:r>
+        <w:t xml:space="preserve"> </w:t>
+      </w:r>
+      <w:r>
+        <w:t xml:space="preserve">di ogni offerta, perché ripeteva il nome del sotto-catalogo</w:t>
+      </w:r>
+      <w:r>
+        <w:t xml:space="preserve"> </w:t>
+      </w:r>
+      <w:r>
+        <w:t xml:space="preserve">(la branca) che la contiene; circa il 15% in meno sul peso del catalogo, nessuna informazione persa.</w:t>
+      </w:r>
+      <w:r>
+        <w:t xml:space="preserve"> </w:t>
+      </w:r>
+      <w:r>
+        <w:t xml:space="preserve">Dati di TuoTempo da segnalare a KOS (il dato strutturato li riporta come sono, come la barra di prenotazione):</w:t>
+      </w:r>
+      <w:r>
+        <w:t xml:space="preserve"> </w:t>
+      </w:r>
+      <w:r>
+        <w:t xml:space="preserve">«VALUTAZIONE STRUMENTALE E CLINICA DELLA DEGLUTIZIONE» nella branca CARDIOLOGIA (Santo Stefano); «RICETTA» come</w:t>
+      </w:r>
+      <w:r>
+        <w:t xml:space="preserve"> </w:t>
+      </w:r>
+      <w:r>
+        <w:t xml:space="preserve">prestazione in VISITE SPECIALISTICHE (Villa Sant'Alessandro).</w:t>
       </w:r>
     </w:p>
     <w:bookmarkEnd w:id="29"/>

</xml_diff>

<commit_message>
KOS-24 note: branche TuoTempo come servizi, foto mancanti
Co-Authored-By: Claude Opus 5.5 <noreply@anthropic.com>
Claude-Session: https://claude.ai/code/session_01Rr1X44gsg7BUwMzrRvYrc2
</commit_message>
<xml_diff>
--- a/docs/docx/kos-24.docx
+++ b/docs/docx/kos-24.docx
@@ -5590,6 +5590,35 @@
       </w:r>
       <w:r>
         <w:t xml:space="preserve">prestazione in VISITE SPECIALISTICHE (Villa Sant'Alessandro).</w:t>
+      </w:r>
+    </w:p>
+    <w:p>
+      <w:pPr>
+        <w:pStyle w:val="BodyText"/>
+      </w:pPr>
+      <w:r>
+        <w:t xml:space="preserve">Da discutere (26/10): usare le branche prenotabili di TuoTempo come fonte aggiuntiva di</w:t>
+      </w:r>
+      <w:r>
+        <w:t xml:space="preserve"> </w:t>
+      </w:r>
+      <w:r>
+        <w:rPr>
+          <w:rStyle w:val="VerbatimChar"/>
+        </w:rPr>
+        <w:t xml:space="preserve">availableService</w:t>
+      </w:r>
+      <w:r>
+        <w:t xml:space="preserve"> </w:t>
+      </w:r>
+      <w:r>
+        <w:t xml:space="preserve">(tabella branca → pagina «Servizi e cure»), presentando le nuove associazioni a KOS come proposte, come le 107 «Da</w:t>
+      </w:r>
+      <w:r>
+        <w:t xml:space="preserve"> </w:t>
+      </w:r>
+      <w:r>
+        <w:t xml:space="preserve">verificare». Da segnalare a KOS: schede senza foto della struttura (es. Ville di Nozzano usa la testata 900×400).</w:t>
       </w:r>
     </w:p>
     <w:bookmarkEnd w:id="29"/>

</xml_diff>

<commit_message>
KOS-24: tecnologie della struttura nel nodo #localbusiness (knowsAbout MedicalDevice)
Co-Authored-By: Claude Opus 5.5 <noreply@anthropic.com>
Claude-Session: https://claude.ai/code/session_01Rr1X44gsg7BUwMzrRvYrc2
</commit_message>
<xml_diff>
--- a/docs/docx/kos-24.docx
+++ b/docs/docx/kos-24.docx
@@ -2,7 +2,7 @@
 <file path=word/document.xml><?xml version="1.0" encoding="utf-8"?>
 <w:document xmlns:w="http://schemas.openxmlformats.org/wordprocessingml/2006/main" xmlns:m="http://schemas.openxmlformats.org/officeDocument/2006/math" xmlns:r="http://schemas.openxmlformats.org/officeDocument/2006/relationships" xmlns:o="urn:schemas-microsoft-com:office:office" xmlns:v="urn:schemas-microsoft-com:vml" xmlns:w10="urn:schemas-microsoft-com:office:word" xmlns:a="http://schemas.openxmlformats.org/drawingml/2006/main" xmlns:pic="http://schemas.openxmlformats.org/drawingml/2006/picture" xmlns:wp="http://schemas.openxmlformats.org/drawingml/2006/wordprocessingDrawing">
   <w:body>
-    <w:bookmarkStart w:id="31" w:name="X13e9b4acbf3cd705c9b15ec2eaf204881b0b6a6"/>
+    <w:bookmarkStart w:id="32" w:name="X13e9b4acbf3cd705c9b15ec2eaf204881b0b6a6"/>
     <w:p>
       <w:pPr>
         <w:pStyle w:val="Heading1"/>
@@ -4800,7 +4800,7 @@
       </w:tr>
     </w:tbl>
     <w:bookmarkEnd w:id="27"/>
-    <w:bookmarkStart w:id="30" w:name="X325e73db51d654a65de349c3c91a896e1f0172c"/>
+    <w:bookmarkStart w:id="31" w:name="X325e73db51d654a65de349c3c91a896e1f0172c"/>
     <w:p>
       <w:pPr>
         <w:pStyle w:val="Heading2"/>
@@ -5622,8 +5622,227 @@
       </w:r>
     </w:p>
     <w:bookmarkEnd w:id="29"/>
+    <w:bookmarkStart w:id="30" w:name="tecnologie-della-struttura-2710"/>
+    <w:p>
+      <w:pPr>
+        <w:pStyle w:val="Heading3"/>
+      </w:pPr>
+      <w:r>
+        <w:t xml:space="preserve">Tecnologie della struttura (27/10)</w:t>
+      </w:r>
+    </w:p>
+    <w:p>
+      <w:pPr>
+        <w:pStyle w:val="FirstParagraph"/>
+      </w:pPr>
+      <w:r>
+        <w:t xml:space="preserve">Le pagine di «Tecnologia e innovazione» associate alla scheda (TV</w:t>
+      </w:r>
+      <w:r>
+        <w:t xml:space="preserve"> </w:t>
+      </w:r>
+      <w:r>
+        <w:rPr>
+          <w:rStyle w:val="VerbatimChar"/>
+        </w:rPr>
+        <w:t xml:space="preserve">mapTecnologie</w:t>
+      </w:r>
+      <w:r>
+        <w:t xml:space="preserve">: 21 tecnologie, 38 associazioni su 9</w:t>
+      </w:r>
+      <w:r>
+        <w:t xml:space="preserve"> </w:t>
+      </w:r>
+      <w:r>
+        <w:t xml:space="preserve">schede, coerenti al 97% con le associazioni dal lato della tecnologia) entrano nel nodo della struttura in</w:t>
+      </w:r>
+      <w:r>
+        <w:t xml:space="preserve"> </w:t>
+      </w:r>
+      <w:r>
+        <w:rPr>
+          <w:rStyle w:val="VerbatimChar"/>
+        </w:rPr>
+        <w:t xml:space="preserve">knowsAbout</w:t>
+      </w:r>
+      <w:r>
+        <w:t xml:space="preserve"> </w:t>
+      </w:r>
+      <w:r>
+        <w:t xml:space="preserve">come</w:t>
+      </w:r>
+      <w:r>
+        <w:t xml:space="preserve"> </w:t>
+      </w:r>
+      <w:r>
+        <w:rPr>
+          <w:rStyle w:val="VerbatimChar"/>
+        </w:rPr>
+        <w:t xml:space="preserve">MedicalDevice</w:t>
+      </w:r>
+      <w:r>
+        <w:t xml:space="preserve">, con nome, URL della pagina e</w:t>
+      </w:r>
+      <w:r>
+        <w:t xml:space="preserve"> </w:t>
+      </w:r>
+      <w:r>
+        <w:rPr>
+          <w:rStyle w:val="VerbatimChar"/>
+        </w:rPr>
+        <w:t xml:space="preserve">@id</w:t>
+      </w:r>
+      <w:r>
+        <w:t xml:space="preserve"> </w:t>
+      </w:r>
+      <w:r>
+        <w:rPr>
+          <w:rStyle w:val="VerbatimChar"/>
+        </w:rPr>
+        <w:t xml:space="preserve">{URL della tecnologia}#device</w:t>
+      </w:r>
+      <w:r>
+        <w:t xml:space="preserve"> </w:t>
+      </w:r>
+      <w:r>
+        <w:t xml:space="preserve">(impostazioni</w:t>
+      </w:r>
+      <w:r>
+        <w:t xml:space="preserve"> </w:t>
+      </w:r>
+      <w:r>
+        <w:rPr>
+          <w:rStyle w:val="VerbatimChar"/>
+        </w:rPr>
+        <w:t xml:space="preserve">kos.struttura_tv_tecnologie</w:t>
+      </w:r>
+      <w:r>
+        <w:t xml:space="preserve"> </w:t>
+      </w:r>
+      <w:r>
+        <w:t xml:space="preserve">=</w:t>
+      </w:r>
+      <w:r>
+        <w:t xml:space="preserve"> </w:t>
+      </w:r>
+      <w:r>
+        <w:rPr>
+          <w:rStyle w:val="VerbatimChar"/>
+        </w:rPr>
+        <w:t xml:space="preserve">mapTecnologie</w:t>
+      </w:r>
+      <w:r>
+        <w:t xml:space="preserve">,</w:t>
+      </w:r>
+      <w:r>
+        <w:t xml:space="preserve"> </w:t>
+      </w:r>
+      <w:r>
+        <w:rPr>
+          <w:rStyle w:val="VerbatimChar"/>
+        </w:rPr>
+        <w:t xml:space="preserve">kos.frag_dispositivo</w:t>
+      </w:r>
+      <w:r>
+        <w:t xml:space="preserve">, default</w:t>
+      </w:r>
+      <w:r>
+        <w:t xml:space="preserve"> </w:t>
+      </w:r>
+      <w:r>
+        <w:rPr>
+          <w:rStyle w:val="VerbatimChar"/>
+        </w:rPr>
+        <w:t xml:space="preserve">#device</w:t>
+      </w:r>
+      <w:r>
+        <w:t xml:space="preserve">). schema.org non ha una</w:t>
+      </w:r>
+      <w:r>
+        <w:t xml:space="preserve"> </w:t>
+      </w:r>
+      <w:r>
+        <w:t xml:space="preserve">proprietà per i dispositivi di una struttura:</w:t>
+      </w:r>
+      <w:r>
+        <w:t xml:space="preserve"> </w:t>
+      </w:r>
+      <w:r>
+        <w:rPr>
+          <w:rStyle w:val="VerbatimChar"/>
+        </w:rPr>
+        <w:t xml:space="preserve">knowsAbout</w:t>
+      </w:r>
+      <w:r>
+        <w:t xml:space="preserve"> </w:t>
+      </w:r>
+      <w:r>
+        <w:t xml:space="preserve">dichiara la competenza, come per le condizioni trattate. Il nodo</w:t>
+      </w:r>
+      <w:r>
+        <w:t xml:space="preserve"> </w:t>
+      </w:r>
+      <w:r>
+        <w:t xml:space="preserve">della pagina della tecnologia (</w:t>
+      </w:r>
+      <w:r>
+        <w:rPr>
+          <w:rStyle w:val="VerbatimChar"/>
+        </w:rPr>
+        <w:t xml:space="preserve">MedicalWebPage</w:t>
+      </w:r>
+      <w:r>
+        <w:t xml:space="preserve"> </w:t>
+      </w:r>
+      <w:r>
+        <w:t xml:space="preserve">con</w:t>
+      </w:r>
+      <w:r>
+        <w:t xml:space="preserve"> </w:t>
+      </w:r>
+      <w:r>
+        <w:rPr>
+          <w:rStyle w:val="VerbatimChar"/>
+        </w:rPr>
+        <w:t xml:space="preserve">about</w:t>
+      </w:r>
+      <w:r>
+        <w:t xml:space="preserve"> </w:t>
+      </w:r>
+      <w:r>
+        <w:t xml:space="preserve">→</w:t>
+      </w:r>
+      <w:r>
+        <w:t xml:space="preserve"> </w:t>
+      </w:r>
+      <w:r>
+        <w:rPr>
+          <w:rStyle w:val="VerbatimChar"/>
+        </w:rPr>
+        <w:t xml:space="preserve">MedicalDevice</w:t>
+      </w:r>
+      <w:r>
+        <w:t xml:space="preserve"> </w:t>
+      </w:r>
+      <w:r>
+        <w:t xml:space="preserve">e le strutture che la usano) è rimandato</w:t>
+      </w:r>
+      <w:r>
+        <w:t xml:space="preserve"> </w:t>
+      </w:r>
+      <w:r>
+        <w:t xml:space="preserve">insieme alla proposta delle pagine delle condizioni come entità mediche. Associazioni da far confermare a KOS insieme alle</w:t>
+      </w:r>
+      <w:r>
+        <w:t xml:space="preserve"> </w:t>
+      </w:r>
+      <w:r>
+        <w:t xml:space="preserve">altre.</w:t>
+      </w:r>
+    </w:p>
     <w:bookmarkEnd w:id="30"/>
     <w:bookmarkEnd w:id="31"/>
+    <w:bookmarkEnd w:id="32"/>
     <w:sectPr/>
   </w:body>
 </w:document>

</xml_diff>

<commit_message>
KOS-24: tecnologie collaudate sullo stage (validatori)
Co-Authored-By: Claude Opus 5.5 <noreply@anthropic.com>
Claude-Session: https://claude.ai/code/session_01Rr1X44gsg7BUwMzrRvYrc2
</commit_message>
<xml_diff>
--- a/docs/docx/kos-24.docx
+++ b/docs/docx/kos-24.docx
@@ -5838,6 +5838,87 @@
       </w:r>
       <w:r>
         <w:t xml:space="preserve">altre.</w:t>
+      </w:r>
+      <w:r>
+        <w:t xml:space="preserve"> </w:t>
+      </w:r>
+      <w:r>
+        <w:t xml:space="preserve">Validatori (27/10 sera, stage): Istituto Santo Stefano con 13</w:t>
+      </w:r>
+      <w:r>
+        <w:t xml:space="preserve"> </w:t>
+      </w:r>
+      <w:r>
+        <w:rPr>
+          <w:rStyle w:val="VerbatimChar"/>
+        </w:rPr>
+        <w:t xml:space="preserve">MedicalDevice</w:t>
+      </w:r>
+      <w:r>
+        <w:t xml:space="preserve"> </w:t>
+      </w:r>
+      <w:r>
+        <w:t xml:space="preserve">in</w:t>
+      </w:r>
+      <w:r>
+        <w:t xml:space="preserve"> </w:t>
+      </w:r>
+      <w:r>
+        <w:rPr>
+          <w:rStyle w:val="VerbatimChar"/>
+        </w:rPr>
+        <w:t xml:space="preserve">knowsAbout</w:t>
+      </w:r>
+      <w:r>
+        <w:t xml:space="preserve">, 0 errori e 0 avvisi su</w:t>
+      </w:r>
+      <w:r>
+        <w:t xml:space="preserve"> </w:t>
+      </w:r>
+      <w:r>
+        <w:t xml:space="preserve">schema.org, «Attività locali» valida nel Rich Results Test. Il primo tentativo era partito da un archivio senza il commit</w:t>
+      </w:r>
+      <w:r>
+        <w:t xml:space="preserve"> </w:t>
+      </w:r>
+      <w:r>
+        <w:t xml:space="preserve">(impostazione assente): verificare sempre</w:t>
+      </w:r>
+      <w:r>
+        <w:t xml:space="preserve"> </w:t>
+      </w:r>
+      <w:r>
+        <w:rPr>
+          <w:rStyle w:val="VerbatimChar"/>
+        </w:rPr>
+        <w:t xml:space="preserve">git log</w:t>
+      </w:r>
+      <w:r>
+        <w:t xml:space="preserve"> </w:t>
+      </w:r>
+      <w:r>
+        <w:t xml:space="preserve">dopo il</w:t>
+      </w:r>
+      <w:r>
+        <w:t xml:space="preserve"> </w:t>
+      </w:r>
+      <w:r>
+        <w:rPr>
+          <w:rStyle w:val="VerbatimChar"/>
+        </w:rPr>
+        <w:t xml:space="preserve">pull</w:t>
+      </w:r>
+      <w:r>
+        <w:t xml:space="preserve">, prima dell'</w:t>
+      </w:r>
+      <w:r>
+        <w:rPr>
+          <w:rStyle w:val="VerbatimChar"/>
+        </w:rPr>
+        <w:t xml:space="preserve">archive</w:t>
+      </w:r>
+      <w:r>
+        <w:t xml:space="preserve">.</w:t>
       </w:r>
     </w:p>
     <w:bookmarkEnd w:id="30"/>

</xml_diff>